<commit_message>
Part 3 has been updated
</commit_message>
<xml_diff>
--- a/COMP5310 Assignment 1.docx
+++ b/COMP5310 Assignment 1.docx
@@ -24,8 +24,29 @@
           <w:szCs w:val="52"/>
           <w:lang w:val="en-US"/>
         </w:rPr>
-        <w:t>COMP5310</w:t>
-      </w:r>
+        <w:t>COMP5310 Assignment 1</w:t>
+      </w:r>
+      <w:r>
+        <w:rPr>
+          <w:rFonts w:ascii="Calibri" w:eastAsia="Calibri" w:hAnsi="Calibri" w:cs="Calibri"/>
+          <w:b/>
+          <w:bCs/>
+          <w:lang w:val="en-US"/>
+        </w:rPr>
+        <w:t xml:space="preserve"> </w:t>
+      </w:r>
+    </w:p>
+    <w:p>
+      <w:pPr>
+        <w:spacing w:line="240" w:lineRule="auto"/>
+        <w:jc w:val="center"/>
+        <w:rPr>
+          <w:rFonts w:ascii="Calibri" w:eastAsia="Calibri" w:hAnsi="Calibri" w:cs="Calibri"/>
+          <w:sz w:val="52"/>
+          <w:szCs w:val="52"/>
+          <w:lang w:val="en-US"/>
+        </w:rPr>
+      </w:pPr>
       <w:r>
         <w:rPr>
           <w:rFonts w:ascii="Calibri" w:eastAsia="Calibri" w:hAnsi="Calibri" w:cs="Calibri"/>
@@ -35,38 +56,6 @@
           <w:szCs w:val="52"/>
           <w:lang w:val="en-US"/>
         </w:rPr>
-        <w:t xml:space="preserve"> Assignment 1</w:t>
-      </w:r>
-      <w:r>
-        <w:rPr>
-          <w:rFonts w:ascii="Calibri" w:eastAsia="Calibri" w:hAnsi="Calibri" w:cs="Calibri"/>
-          <w:b/>
-          <w:bCs/>
-          <w:lang w:val="en-US"/>
-        </w:rPr>
-        <w:t xml:space="preserve"> </w:t>
-      </w:r>
-    </w:p>
-    <w:p>
-      <w:pPr>
-        <w:spacing w:line="240" w:lineRule="auto"/>
-        <w:jc w:val="center"/>
-        <w:rPr>
-          <w:rFonts w:ascii="Calibri" w:eastAsia="Calibri" w:hAnsi="Calibri" w:cs="Calibri"/>
-          <w:sz w:val="52"/>
-          <w:szCs w:val="52"/>
-          <w:lang w:val="en-US"/>
-        </w:rPr>
-      </w:pPr>
-      <w:r>
-        <w:rPr>
-          <w:rFonts w:ascii="Calibri" w:eastAsia="Calibri" w:hAnsi="Calibri" w:cs="Calibri"/>
-          <w:b/>
-          <w:bCs/>
-          <w:sz w:val="52"/>
-          <w:szCs w:val="52"/>
-          <w:lang w:val="en-US"/>
-        </w:rPr>
         <w:t>Report</w:t>
       </w:r>
       <w:r>
@@ -161,46 +150,49 @@
           <w:sz w:val="52"/>
           <w:szCs w:val="52"/>
         </w:rPr>
-        <w:t xml:space="preserve">Sia Kaur </w:t>
-      </w:r>
-      <w:proofErr w:type="spellStart"/>
-      <w:r>
+        <w:t>Sia Kaur Tervinder Singh Duggal</w:t>
+      </w:r>
+    </w:p>
+    <w:p>
+      <w:pPr>
+        <w:spacing w:line="240" w:lineRule="auto"/>
+        <w:ind w:left="360"/>
+        <w:jc w:val="center"/>
         <w:rPr>
           <w:rFonts w:ascii="Calibri" w:eastAsia="Calibri" w:hAnsi="Calibri" w:cs="Calibri"/>
           <w:sz w:val="52"/>
           <w:szCs w:val="52"/>
         </w:rPr>
-        <w:t>Tervinder</w:t>
-      </w:r>
-      <w:proofErr w:type="spellEnd"/>
+      </w:pPr>
       <w:r>
         <w:rPr>
           <w:rFonts w:ascii="Calibri" w:eastAsia="Calibri" w:hAnsi="Calibri" w:cs="Calibri"/>
           <w:sz w:val="52"/>
           <w:szCs w:val="52"/>
         </w:rPr>
-        <w:t xml:space="preserve"> Singh Duggal</w:t>
-      </w:r>
-    </w:p>
-    <w:p>
-      <w:pPr>
-        <w:spacing w:line="240" w:lineRule="auto"/>
-        <w:ind w:left="360"/>
+        <w:t>Yanjun Zhu</w:t>
+      </w:r>
+    </w:p>
+    <w:p>
+      <w:pPr>
+        <w:spacing w:line="240" w:lineRule="auto"/>
         <w:jc w:val="center"/>
         <w:rPr>
           <w:rFonts w:ascii="Calibri" w:eastAsia="Calibri" w:hAnsi="Calibri" w:cs="Calibri"/>
           <w:sz w:val="52"/>
           <w:szCs w:val="52"/>
-        </w:rPr>
-      </w:pPr>
-      <w:r>
-        <w:rPr>
-          <w:rFonts w:ascii="Calibri" w:eastAsia="Calibri" w:hAnsi="Calibri" w:cs="Calibri"/>
-          <w:sz w:val="52"/>
-          <w:szCs w:val="52"/>
-        </w:rPr>
-        <w:t>Yanjun Zhu</w:t>
-      </w:r>
+          <w:lang w:val="en-US"/>
+        </w:rPr>
+      </w:pPr>
+    </w:p>
+    <w:p>
+      <w:pPr>
+        <w:spacing w:line="240" w:lineRule="auto"/>
+        <w:rPr>
+          <w:rFonts w:ascii="Calibri" w:eastAsia="Calibri" w:hAnsi="Calibri" w:cs="Calibri"/>
+          <w:lang w:val="en-US"/>
+        </w:rPr>
+      </w:pPr>
     </w:p>
     <w:p>
       <w:pPr>
@@ -208,12 +200,329 @@
         <w:jc w:val="center"/>
         <w:rPr>
           <w:rFonts w:ascii="Calibri" w:eastAsia="Calibri" w:hAnsi="Calibri" w:cs="Calibri"/>
-          <w:sz w:val="52"/>
-          <w:szCs w:val="52"/>
-          <w:lang w:val="en-US"/>
-        </w:rPr>
-      </w:pPr>
-    </w:p>
+          <w:lang w:val="en-US"/>
+        </w:rPr>
+      </w:pPr>
+    </w:p>
+    <w:tbl>
+      <w:tblPr>
+        <w:tblStyle w:val="GridTable4"/>
+        <w:tblW w:w="9322" w:type="dxa"/>
+        <w:tblLook w:val="04A0" w:firstRow="1" w:lastRow="0" w:firstColumn="1" w:lastColumn="0" w:noHBand="0" w:noVBand="1"/>
+      </w:tblPr>
+      <w:tblGrid>
+        <w:gridCol w:w="4644"/>
+        <w:gridCol w:w="4678"/>
+      </w:tblGrid>
+      <w:tr>
+        <w:trPr>
+          <w:cnfStyle w:val="100000000000" w:firstRow="1" w:lastRow="0" w:firstColumn="0" w:lastColumn="0" w:oddVBand="0" w:evenVBand="0" w:oddHBand="0" w:evenHBand="0" w:firstRowFirstColumn="0" w:firstRowLastColumn="0" w:lastRowFirstColumn="0" w:lastRowLastColumn="0"/>
+          <w:trHeight w:val="454"/>
+        </w:trPr>
+        <w:tc>
+          <w:tcPr>
+            <w:cnfStyle w:val="001000000000" w:firstRow="0" w:lastRow="0" w:firstColumn="1" w:lastColumn="0" w:oddVBand="0" w:evenVBand="0" w:oddHBand="0" w:evenHBand="0" w:firstRowFirstColumn="0" w:firstRowLastColumn="0" w:lastRowFirstColumn="0" w:lastRowLastColumn="0"/>
+            <w:tcW w:w="9322" w:type="dxa"/>
+            <w:gridSpan w:val="2"/>
+          </w:tcPr>
+          <w:p>
+            <w:pPr>
+              <w:spacing w:line="240" w:lineRule="auto"/>
+              <w:jc w:val="center"/>
+              <w:rPr>
+                <w:rFonts w:ascii="Calibri" w:eastAsia="Calibri" w:hAnsi="Calibri" w:cs="Calibri"/>
+                <w:lang w:val="en-US"/>
+              </w:rPr>
+            </w:pPr>
+            <w:r>
+              <w:rPr>
+                <w:rFonts w:ascii="Calibri" w:eastAsia="Calibri" w:hAnsi="Calibri" w:cs="Calibri"/>
+                <w:lang w:val="en-US"/>
+              </w:rPr>
+              <w:t>Contribution Table</w:t>
+            </w:r>
+          </w:p>
+        </w:tc>
+      </w:tr>
+      <w:tr>
+        <w:trPr>
+          <w:cnfStyle w:val="000000100000" w:firstRow="0" w:lastRow="0" w:firstColumn="0" w:lastColumn="0" w:oddVBand="0" w:evenVBand="0" w:oddHBand="1" w:evenHBand="0" w:firstRowFirstColumn="0" w:firstRowLastColumn="0" w:lastRowFirstColumn="0" w:lastRowLastColumn="0"/>
+          <w:trHeight w:val="454"/>
+        </w:trPr>
+        <w:tc>
+          <w:tcPr>
+            <w:cnfStyle w:val="001000000000" w:firstRow="0" w:lastRow="0" w:firstColumn="1" w:lastColumn="0" w:oddVBand="0" w:evenVBand="0" w:oddHBand="0" w:evenHBand="0" w:firstRowFirstColumn="0" w:firstRowLastColumn="0" w:lastRowFirstColumn="0" w:lastRowLastColumn="0"/>
+            <w:tcW w:w="4644" w:type="dxa"/>
+            <w:shd w:val="clear" w:color="auto" w:fill="auto"/>
+          </w:tcPr>
+          <w:p>
+            <w:pPr>
+              <w:spacing w:line="240" w:lineRule="auto"/>
+              <w:jc w:val="center"/>
+              <w:rPr>
+                <w:rFonts w:ascii="Calibri" w:eastAsia="Calibri" w:hAnsi="Calibri" w:cs="Calibri"/>
+                <w:lang w:val="en-US"/>
+              </w:rPr>
+            </w:pPr>
+            <w:r>
+              <w:rPr>
+                <w:rFonts w:ascii="Calibri" w:eastAsia="Calibri" w:hAnsi="Calibri" w:cs="Calibri"/>
+                <w:lang w:val="en-US"/>
+              </w:rPr>
+              <w:t xml:space="preserve">Dataset Audition and Selection </w:t>
+            </w:r>
+          </w:p>
+        </w:tc>
+        <w:tc>
+          <w:tcPr>
+            <w:tcW w:w="4678" w:type="dxa"/>
+            <w:shd w:val="clear" w:color="auto" w:fill="auto"/>
+          </w:tcPr>
+          <w:p>
+            <w:pPr>
+              <w:spacing w:line="240" w:lineRule="auto"/>
+              <w:jc w:val="center"/>
+              <w:cnfStyle w:val="000000100000" w:firstRow="0" w:lastRow="0" w:firstColumn="0" w:lastColumn="0" w:oddVBand="0" w:evenVBand="0" w:oddHBand="1" w:evenHBand="0" w:firstRowFirstColumn="0" w:firstRowLastColumn="0" w:lastRowFirstColumn="0" w:lastRowLastColumn="0"/>
+              <w:rPr>
+                <w:rFonts w:ascii="Calibri" w:eastAsia="Calibri" w:hAnsi="Calibri" w:cs="Calibri"/>
+                <w:lang w:val="en-US"/>
+              </w:rPr>
+            </w:pPr>
+            <w:r>
+              <w:rPr>
+                <w:rFonts w:ascii="Calibri" w:eastAsia="Calibri" w:hAnsi="Calibri" w:cs="Calibri"/>
+                <w:lang w:val="en-US"/>
+              </w:rPr>
+              <w:t>Sia Kaur Tervinder Singh Duggal</w:t>
+            </w:r>
+          </w:p>
+        </w:tc>
+      </w:tr>
+      <w:tr>
+        <w:trPr>
+          <w:trHeight w:val="454"/>
+        </w:trPr>
+        <w:tc>
+          <w:tcPr>
+            <w:cnfStyle w:val="001000000000" w:firstRow="0" w:lastRow="0" w:firstColumn="1" w:lastColumn="0" w:oddVBand="0" w:evenVBand="0" w:oddHBand="0" w:evenHBand="0" w:firstRowFirstColumn="0" w:firstRowLastColumn="0" w:lastRowFirstColumn="0" w:lastRowLastColumn="0"/>
+            <w:tcW w:w="4644" w:type="dxa"/>
+          </w:tcPr>
+          <w:p>
+            <w:pPr>
+              <w:spacing w:line="240" w:lineRule="auto"/>
+              <w:jc w:val="center"/>
+              <w:rPr>
+                <w:rFonts w:ascii="Calibri" w:eastAsia="Calibri" w:hAnsi="Calibri" w:cs="Calibri"/>
+                <w:lang w:val="en-US"/>
+              </w:rPr>
+            </w:pPr>
+            <w:r>
+              <w:rPr>
+                <w:rFonts w:ascii="Calibri" w:eastAsia="Calibri" w:hAnsi="Calibri" w:cs="Calibri"/>
+                <w:lang w:val="en-US"/>
+              </w:rPr>
+              <w:t xml:space="preserve">Stakeholder Problem and Success Criteria </w:t>
+            </w:r>
+          </w:p>
+        </w:tc>
+        <w:tc>
+          <w:tcPr>
+            <w:tcW w:w="4678" w:type="dxa"/>
+          </w:tcPr>
+          <w:p>
+            <w:pPr>
+              <w:spacing w:line="240" w:lineRule="auto"/>
+              <w:jc w:val="center"/>
+              <w:cnfStyle w:val="000000000000" w:firstRow="0" w:lastRow="0" w:firstColumn="0" w:lastColumn="0" w:oddVBand="0" w:evenVBand="0" w:oddHBand="0" w:evenHBand="0" w:firstRowFirstColumn="0" w:firstRowLastColumn="0" w:lastRowFirstColumn="0" w:lastRowLastColumn="0"/>
+              <w:rPr>
+                <w:rFonts w:ascii="Calibri" w:eastAsia="Calibri" w:hAnsi="Calibri" w:cs="Calibri"/>
+                <w:lang w:val="en-US"/>
+              </w:rPr>
+            </w:pPr>
+            <w:r>
+              <w:rPr>
+                <w:rFonts w:ascii="Calibri" w:eastAsia="Calibri" w:hAnsi="Calibri" w:cs="Calibri"/>
+                <w:lang w:val="en-US"/>
+              </w:rPr>
+              <w:t>Yanjun Zhu</w:t>
+            </w:r>
+          </w:p>
+        </w:tc>
+      </w:tr>
+      <w:tr>
+        <w:trPr>
+          <w:cnfStyle w:val="000000100000" w:firstRow="0" w:lastRow="0" w:firstColumn="0" w:lastColumn="0" w:oddVBand="0" w:evenVBand="0" w:oddHBand="1" w:evenHBand="0" w:firstRowFirstColumn="0" w:firstRowLastColumn="0" w:lastRowFirstColumn="0" w:lastRowLastColumn="0"/>
+          <w:trHeight w:val="454"/>
+        </w:trPr>
+        <w:tc>
+          <w:tcPr>
+            <w:cnfStyle w:val="001000000000" w:firstRow="0" w:lastRow="0" w:firstColumn="1" w:lastColumn="0" w:oddVBand="0" w:evenVBand="0" w:oddHBand="0" w:evenHBand="0" w:firstRowFirstColumn="0" w:firstRowLastColumn="0" w:lastRowFirstColumn="0" w:lastRowLastColumn="0"/>
+            <w:tcW w:w="4644" w:type="dxa"/>
+            <w:shd w:val="clear" w:color="auto" w:fill="auto"/>
+          </w:tcPr>
+          <w:p>
+            <w:pPr>
+              <w:spacing w:line="240" w:lineRule="auto"/>
+              <w:jc w:val="center"/>
+              <w:rPr>
+                <w:rFonts w:ascii="Calibri" w:eastAsia="Calibri" w:hAnsi="Calibri" w:cs="Calibri"/>
+                <w:lang w:val="en-US"/>
+              </w:rPr>
+            </w:pPr>
+            <w:r>
+              <w:rPr>
+                <w:rFonts w:ascii="Calibri" w:eastAsia="Calibri" w:hAnsi="Calibri" w:cs="Calibri"/>
+                <w:lang w:val="en-US"/>
+              </w:rPr>
+              <w:t xml:space="preserve">Data-Readiness Pipeline </w:t>
+            </w:r>
+          </w:p>
+        </w:tc>
+        <w:tc>
+          <w:tcPr>
+            <w:tcW w:w="4678" w:type="dxa"/>
+            <w:shd w:val="clear" w:color="auto" w:fill="auto"/>
+          </w:tcPr>
+          <w:p>
+            <w:pPr>
+              <w:spacing w:line="240" w:lineRule="auto"/>
+              <w:jc w:val="center"/>
+              <w:cnfStyle w:val="000000100000" w:firstRow="0" w:lastRow="0" w:firstColumn="0" w:lastColumn="0" w:oddVBand="0" w:evenVBand="0" w:oddHBand="1" w:evenHBand="0" w:firstRowFirstColumn="0" w:firstRowLastColumn="0" w:lastRowFirstColumn="0" w:lastRowLastColumn="0"/>
+              <w:rPr>
+                <w:rFonts w:ascii="Calibri" w:eastAsia="Calibri" w:hAnsi="Calibri" w:cs="Calibri"/>
+                <w:lang w:val="en-US"/>
+              </w:rPr>
+            </w:pPr>
+            <w:r>
+              <w:rPr>
+                <w:rFonts w:ascii="Calibri" w:eastAsia="Calibri" w:hAnsi="Calibri" w:cs="Calibri"/>
+                <w:lang w:val="en-US"/>
+              </w:rPr>
+              <w:t>Sia Kaur Tervinder Singh Duggal</w:t>
+            </w:r>
+          </w:p>
+        </w:tc>
+      </w:tr>
+      <w:tr>
+        <w:trPr>
+          <w:trHeight w:val="454"/>
+        </w:trPr>
+        <w:tc>
+          <w:tcPr>
+            <w:cnfStyle w:val="001000000000" w:firstRow="0" w:lastRow="0" w:firstColumn="1" w:lastColumn="0" w:oddVBand="0" w:evenVBand="0" w:oddHBand="0" w:evenHBand="0" w:firstRowFirstColumn="0" w:firstRowLastColumn="0" w:lastRowFirstColumn="0" w:lastRowLastColumn="0"/>
+            <w:tcW w:w="4644" w:type="dxa"/>
+          </w:tcPr>
+          <w:p>
+            <w:pPr>
+              <w:spacing w:line="240" w:lineRule="auto"/>
+              <w:jc w:val="center"/>
+              <w:rPr>
+                <w:rFonts w:ascii="Calibri" w:eastAsia="Calibri" w:hAnsi="Calibri" w:cs="Calibri"/>
+                <w:lang w:val="en-US"/>
+              </w:rPr>
+            </w:pPr>
+            <w:r>
+              <w:rPr>
+                <w:rFonts w:ascii="Calibri" w:eastAsia="Calibri" w:hAnsi="Calibri" w:cs="Calibri"/>
+                <w:lang w:val="en-US"/>
+              </w:rPr>
+              <w:t xml:space="preserve">Exploratory Data Analysis </w:t>
+            </w:r>
+          </w:p>
+        </w:tc>
+        <w:tc>
+          <w:tcPr>
+            <w:tcW w:w="4678" w:type="dxa"/>
+          </w:tcPr>
+          <w:p>
+            <w:pPr>
+              <w:spacing w:line="240" w:lineRule="auto"/>
+              <w:jc w:val="center"/>
+              <w:cnfStyle w:val="000000000000" w:firstRow="0" w:lastRow="0" w:firstColumn="0" w:lastColumn="0" w:oddVBand="0" w:evenVBand="0" w:oddHBand="0" w:evenHBand="0" w:firstRowFirstColumn="0" w:firstRowLastColumn="0" w:lastRowFirstColumn="0" w:lastRowLastColumn="0"/>
+              <w:rPr>
+                <w:rFonts w:ascii="Calibri" w:eastAsia="Calibri" w:hAnsi="Calibri" w:cs="Calibri"/>
+                <w:lang w:val="en-US"/>
+              </w:rPr>
+            </w:pPr>
+            <w:r>
+              <w:rPr>
+                <w:rFonts w:ascii="Calibri" w:eastAsia="Calibri" w:hAnsi="Calibri" w:cs="Calibri"/>
+                <w:lang w:val="en-US"/>
+              </w:rPr>
+              <w:t>Yanjun Zhu</w:t>
+            </w:r>
+          </w:p>
+        </w:tc>
+      </w:tr>
+      <w:tr>
+        <w:trPr>
+          <w:cnfStyle w:val="000000100000" w:firstRow="0" w:lastRow="0" w:firstColumn="0" w:lastColumn="0" w:oddVBand="0" w:evenVBand="0" w:oddHBand="1" w:evenHBand="0" w:firstRowFirstColumn="0" w:firstRowLastColumn="0" w:lastRowFirstColumn="0" w:lastRowLastColumn="0"/>
+          <w:trHeight w:val="454"/>
+        </w:trPr>
+        <w:tc>
+          <w:tcPr>
+            <w:cnfStyle w:val="001000000000" w:firstRow="0" w:lastRow="0" w:firstColumn="1" w:lastColumn="0" w:oddVBand="0" w:evenVBand="0" w:oddHBand="0" w:evenHBand="0" w:firstRowFirstColumn="0" w:firstRowLastColumn="0" w:lastRowFirstColumn="0" w:lastRowLastColumn="0"/>
+            <w:tcW w:w="4644" w:type="dxa"/>
+            <w:shd w:val="clear" w:color="auto" w:fill="auto"/>
+          </w:tcPr>
+          <w:p>
+            <w:pPr>
+              <w:spacing w:line="240" w:lineRule="auto"/>
+              <w:jc w:val="center"/>
+              <w:rPr>
+                <w:rFonts w:ascii="Calibri" w:eastAsia="Calibri" w:hAnsi="Calibri" w:cs="Calibri"/>
+                <w:lang w:val="en-US"/>
+              </w:rPr>
+            </w:pPr>
+            <w:r>
+              <w:rPr>
+                <w:rFonts w:ascii="Calibri" w:eastAsia="Calibri" w:hAnsi="Calibri" w:cs="Calibri"/>
+                <w:lang w:val="en-US"/>
+              </w:rPr>
+              <w:t xml:space="preserve">Reproducibility and Team Process </w:t>
+            </w:r>
+          </w:p>
+        </w:tc>
+        <w:tc>
+          <w:tcPr>
+            <w:tcW w:w="4678" w:type="dxa"/>
+            <w:shd w:val="clear" w:color="auto" w:fill="auto"/>
+          </w:tcPr>
+          <w:p>
+            <w:pPr>
+              <w:spacing w:line="240" w:lineRule="auto"/>
+              <w:jc w:val="center"/>
+              <w:cnfStyle w:val="000000100000" w:firstRow="0" w:lastRow="0" w:firstColumn="0" w:lastColumn="0" w:oddVBand="0" w:evenVBand="0" w:oddHBand="1" w:evenHBand="0" w:firstRowFirstColumn="0" w:firstRowLastColumn="0" w:lastRowFirstColumn="0" w:lastRowLastColumn="0"/>
+              <w:rPr>
+                <w:rFonts w:ascii="Calibri" w:eastAsia="Calibri" w:hAnsi="Calibri" w:cs="Calibri"/>
+                <w:lang w:val="en-US"/>
+              </w:rPr>
+            </w:pPr>
+            <w:r>
+              <w:rPr>
+                <w:rFonts w:ascii="Calibri" w:eastAsia="Calibri" w:hAnsi="Calibri" w:cs="Calibri"/>
+                <w:lang w:val="en-US"/>
+              </w:rPr>
+              <w:t>Yanjun Zhu</w:t>
+            </w:r>
+            <w:r>
+              <w:rPr>
+                <w:rFonts w:ascii="Calibri" w:eastAsia="Calibri" w:hAnsi="Calibri" w:cs="Calibri"/>
+                <w:lang w:val="en-US"/>
+              </w:rPr>
+              <w:t xml:space="preserve"> &amp; </w:t>
+            </w:r>
+            <w:r>
+              <w:rPr>
+                <w:rFonts w:ascii="Calibri" w:eastAsia="Calibri" w:hAnsi="Calibri" w:cs="Calibri"/>
+                <w:lang w:val="en-US"/>
+              </w:rPr>
+              <w:t>Sia Kaur Tervinder Singh Duggal</w:t>
+            </w:r>
+          </w:p>
+        </w:tc>
+      </w:tr>
+    </w:tbl>
     <w:p>
       <w:pPr>
         <w:spacing w:line="240" w:lineRule="auto"/>
@@ -237,117 +546,42 @@
     <w:p>
       <w:pPr>
         <w:spacing w:line="240" w:lineRule="auto"/>
-        <w:jc w:val="center"/>
-        <w:rPr>
-          <w:rFonts w:ascii="Calibri" w:eastAsia="Calibri" w:hAnsi="Calibri" w:cs="Calibri"/>
-          <w:lang w:val="en-US"/>
-        </w:rPr>
-      </w:pPr>
-    </w:p>
-    <w:p>
-      <w:pPr>
-        <w:spacing w:line="240" w:lineRule="auto"/>
-        <w:jc w:val="center"/>
-        <w:rPr>
-          <w:rFonts w:ascii="Calibri" w:eastAsia="Calibri" w:hAnsi="Calibri" w:cs="Calibri"/>
-          <w:lang w:val="en-US"/>
-        </w:rPr>
-      </w:pPr>
-    </w:p>
-    <w:p>
-      <w:pPr>
-        <w:spacing w:line="240" w:lineRule="auto"/>
-        <w:jc w:val="center"/>
-        <w:rPr>
-          <w:rFonts w:ascii="Calibri" w:eastAsia="Calibri" w:hAnsi="Calibri" w:cs="Calibri"/>
-          <w:lang w:val="en-US"/>
-        </w:rPr>
-      </w:pPr>
-    </w:p>
-    <w:p>
-      <w:pPr>
-        <w:spacing w:line="240" w:lineRule="auto"/>
-        <w:jc w:val="center"/>
-        <w:rPr>
-          <w:rFonts w:ascii="Calibri" w:eastAsia="Calibri" w:hAnsi="Calibri" w:cs="Calibri"/>
-          <w:lang w:val="en-US"/>
-        </w:rPr>
-      </w:pPr>
-    </w:p>
-    <w:p>
-      <w:pPr>
-        <w:spacing w:line="240" w:lineRule="auto"/>
-        <w:jc w:val="center"/>
-        <w:rPr>
-          <w:rFonts w:ascii="Calibri" w:eastAsia="Calibri" w:hAnsi="Calibri" w:cs="Calibri"/>
-          <w:lang w:val="en-US"/>
-        </w:rPr>
-      </w:pPr>
-    </w:p>
-    <w:p>
-      <w:pPr>
-        <w:spacing w:line="240" w:lineRule="auto"/>
-        <w:jc w:val="center"/>
-        <w:rPr>
-          <w:rFonts w:ascii="Calibri" w:eastAsia="Calibri" w:hAnsi="Calibri" w:cs="Calibri"/>
-          <w:lang w:val="en-US"/>
-        </w:rPr>
-      </w:pPr>
-    </w:p>
-    <w:p>
-      <w:pPr>
-        <w:spacing w:line="240" w:lineRule="auto"/>
-        <w:jc w:val="center"/>
-        <w:rPr>
-          <w:rFonts w:ascii="Calibri" w:eastAsia="Calibri" w:hAnsi="Calibri" w:cs="Calibri"/>
-          <w:lang w:val="en-US"/>
-        </w:rPr>
-      </w:pPr>
-    </w:p>
-    <w:p>
-      <w:pPr>
-        <w:spacing w:line="240" w:lineRule="auto"/>
-        <w:jc w:val="center"/>
-        <w:rPr>
-          <w:rFonts w:ascii="Calibri" w:eastAsia="Calibri" w:hAnsi="Calibri" w:cs="Calibri"/>
-          <w:lang w:val="en-US"/>
-        </w:rPr>
-      </w:pPr>
-    </w:p>
-    <w:p>
-      <w:pPr>
-        <w:spacing w:line="240" w:lineRule="auto"/>
-        <w:jc w:val="center"/>
-        <w:rPr>
-          <w:rFonts w:ascii="Calibri" w:eastAsia="Calibri" w:hAnsi="Calibri" w:cs="Calibri"/>
-          <w:lang w:val="en-US"/>
-        </w:rPr>
-      </w:pPr>
-    </w:p>
-    <w:p>
-      <w:pPr>
-        <w:spacing w:line="240" w:lineRule="auto"/>
-        <w:jc w:val="center"/>
-        <w:rPr>
-          <w:rFonts w:ascii="Calibri" w:eastAsia="Calibri" w:hAnsi="Calibri" w:cs="Calibri"/>
-          <w:lang w:val="en-US"/>
-        </w:rPr>
-      </w:pPr>
-    </w:p>
-    <w:p>
-      <w:pPr>
-        <w:spacing w:line="240" w:lineRule="auto"/>
-        <w:jc w:val="center"/>
-        <w:rPr>
-          <w:rFonts w:ascii="Calibri" w:eastAsia="Calibri" w:hAnsi="Calibri" w:cs="Calibri"/>
-          <w:lang w:val="en-US"/>
-        </w:rPr>
-      </w:pPr>
-    </w:p>
-    <w:p>
-      <w:pPr>
-        <w:spacing w:line="240" w:lineRule="auto"/>
-        <w:jc w:val="center"/>
+        <w:rPr>
+          <w:rFonts w:ascii="Calibri" w:eastAsia="Calibri" w:hAnsi="Calibri" w:cs="Calibri"/>
+          <w:lang w:val="en-US"/>
+        </w:rPr>
+      </w:pPr>
+    </w:p>
+    <w:p>
+      <w:pPr>
+        <w:spacing w:line="240" w:lineRule="auto"/>
+        <w:rPr>
+          <w:rFonts w:ascii="Calibri" w:eastAsia="Calibri" w:hAnsi="Calibri" w:cs="Calibri"/>
+          <w:lang w:val="en-US"/>
+        </w:rPr>
+      </w:pPr>
+    </w:p>
+    <w:p>
+      <w:pPr>
+        <w:spacing w:line="240" w:lineRule="auto"/>
+        <w:rPr>
+          <w:rFonts w:ascii="Calibri" w:eastAsia="Calibri" w:hAnsi="Calibri" w:cs="Calibri"/>
+          <w:lang w:val="en-US"/>
+        </w:rPr>
+      </w:pPr>
+    </w:p>
+    <w:p>
+      <w:pPr>
+        <w:spacing w:line="240" w:lineRule="auto"/>
+        <w:rPr>
+          <w:rFonts w:ascii="Calibri" w:eastAsia="Calibri" w:hAnsi="Calibri" w:cs="Calibri"/>
+          <w:lang w:val="en-US"/>
+        </w:rPr>
+      </w:pPr>
+    </w:p>
+    <w:p>
+      <w:pPr>
+        <w:spacing w:line="240" w:lineRule="auto"/>
         <w:rPr>
           <w:rFonts w:ascii="Calibri" w:eastAsia="Calibri" w:hAnsi="Calibri" w:cs="Calibri"/>
           <w:lang w:val="en-US"/>
@@ -399,15 +633,7 @@
           <w:b/>
           <w:bCs/>
         </w:rPr>
-        <w:t>Comparative</w:t>
-      </w:r>
-      <w:r>
-        <w:rPr>
-          <w:rFonts w:ascii="Calibri" w:eastAsia="Calibri" w:hAnsi="Calibri" w:cs="Calibri"/>
-          <w:b/>
-          <w:bCs/>
-        </w:rPr>
-        <w:t xml:space="preserve"> Analysis</w:t>
+        <w:t>Comparative Analysis</w:t>
       </w:r>
     </w:p>
     <w:p>
@@ -767,6 +993,7 @@
         <w:rPr>
           <w:rFonts w:ascii="Calibri" w:eastAsia="Calibri" w:hAnsi="Calibri" w:cs="Calibri"/>
         </w:rPr>
+        <w:lastRenderedPageBreak/>
         <w:t xml:space="preserve"> </w:t>
       </w:r>
     </w:p>
@@ -810,7 +1037,6 @@
               <w:rPr>
                 <w:rFonts w:ascii="Calibri" w:eastAsia="Calibri" w:hAnsi="Calibri" w:cs="Calibri"/>
               </w:rPr>
-              <w:lastRenderedPageBreak/>
               <w:t>Dataset</w:t>
             </w:r>
           </w:p>
@@ -1897,6 +2123,825 @@
     <w:p>
       <w:pPr>
         <w:spacing w:line="240" w:lineRule="auto"/>
+      </w:pPr>
+    </w:p>
+    <w:p>
+      <w:pPr>
+        <w:spacing w:line="240" w:lineRule="auto"/>
+      </w:pPr>
+    </w:p>
+    <w:p>
+      <w:pPr>
+        <w:spacing w:line="240" w:lineRule="auto"/>
+      </w:pPr>
+    </w:p>
+    <w:p>
+      <w:pPr>
+        <w:spacing w:line="240" w:lineRule="auto"/>
+      </w:pPr>
+    </w:p>
+    <w:p>
+      <w:pPr>
+        <w:spacing w:line="240" w:lineRule="auto"/>
+      </w:pPr>
+    </w:p>
+    <w:p>
+      <w:pPr>
+        <w:spacing w:line="240" w:lineRule="auto"/>
+      </w:pPr>
+    </w:p>
+    <w:p>
+      <w:pPr>
+        <w:spacing w:line="240" w:lineRule="auto"/>
+      </w:pPr>
+    </w:p>
+    <w:p>
+      <w:pPr>
+        <w:spacing w:line="240" w:lineRule="auto"/>
+        <w:jc w:val="center"/>
+        <w:cnfStyle w:val="001000100000" w:firstRow="0" w:lastRow="0" w:firstColumn="1" w:lastColumn="0" w:oddVBand="0" w:evenVBand="0" w:oddHBand="1" w:evenHBand="0" w:firstRowFirstColumn="0" w:firstRowLastColumn="0" w:lastRowFirstColumn="0" w:lastRowLastColumn="0"/>
+        <w:rPr>
+          <w:rFonts w:ascii="Calibri" w:eastAsia="Calibri" w:hAnsi="Calibri" w:cs="Calibri"/>
+          <w:b/>
+          <w:bCs/>
+          <w:lang w:val="en-US"/>
+        </w:rPr>
+      </w:pPr>
+      <w:r>
+        <w:rPr>
+          <w:b/>
+          <w:bCs/>
+        </w:rPr>
+        <w:t>3.</w:t>
+      </w:r>
+      <w:r>
+        <w:rPr>
+          <w:rFonts w:ascii="Calibri" w:eastAsia="Calibri" w:hAnsi="Calibri" w:cs="Calibri"/>
+          <w:b/>
+          <w:bCs/>
+          <w:lang w:val="en-US"/>
+        </w:rPr>
+        <w:t xml:space="preserve"> </w:t>
+      </w:r>
+      <w:r>
+        <w:rPr>
+          <w:rFonts w:ascii="Calibri" w:eastAsia="Calibri" w:hAnsi="Calibri" w:cs="Calibri"/>
+          <w:b/>
+          <w:bCs/>
+          <w:lang w:val="en-US"/>
+        </w:rPr>
+        <w:t>Data-Readiness Pipeline</w:t>
+      </w:r>
+    </w:p>
+    <w:p>
+      <w:pPr>
+        <w:spacing w:line="240" w:lineRule="auto"/>
+        <w:jc w:val="center"/>
+        <w:cnfStyle w:val="001000100000" w:firstRow="0" w:lastRow="0" w:firstColumn="1" w:lastColumn="0" w:oddVBand="0" w:evenVBand="0" w:oddHBand="1" w:evenHBand="0" w:firstRowFirstColumn="0" w:firstRowLastColumn="0" w:lastRowFirstColumn="0" w:lastRowLastColumn="0"/>
+        <w:rPr>
+          <w:rFonts w:ascii="Calibri" w:eastAsia="Calibri" w:hAnsi="Calibri" w:cs="Calibri"/>
+          <w:b/>
+          <w:bCs/>
+          <w:lang w:val="en-US"/>
+        </w:rPr>
+      </w:pPr>
+    </w:p>
+    <w:p>
+      <w:pPr>
+        <w:spacing w:line="240" w:lineRule="auto"/>
+        <w:cnfStyle w:val="001000100000" w:firstRow="0" w:lastRow="0" w:firstColumn="1" w:lastColumn="0" w:oddVBand="0" w:evenVBand="0" w:oddHBand="1" w:evenHBand="0" w:firstRowFirstColumn="0" w:firstRowLastColumn="0" w:lastRowFirstColumn="0" w:lastRowLastColumn="0"/>
+        <w:rPr>
+          <w:rFonts w:ascii="Calibri" w:eastAsia="Calibri" w:hAnsi="Calibri" w:cs="Calibri"/>
+          <w:b/>
+          <w:bCs/>
+        </w:rPr>
+      </w:pPr>
+      <w:r>
+        <w:rPr>
+          <w:rFonts w:ascii="Calibri" w:eastAsia="Calibri" w:hAnsi="Calibri" w:cs="Calibri"/>
+          <w:b/>
+          <w:bCs/>
+        </w:rPr>
+        <w:t>Data Quality Audit</w:t>
+      </w:r>
+    </w:p>
+    <w:p>
+      <w:pPr>
+        <w:spacing w:line="240" w:lineRule="auto"/>
+        <w:cnfStyle w:val="001000100000" w:firstRow="0" w:lastRow="0" w:firstColumn="1" w:lastColumn="0" w:oddVBand="0" w:evenVBand="0" w:oddHBand="1" w:evenHBand="0" w:firstRowFirstColumn="0" w:firstRowLastColumn="0" w:lastRowFirstColumn="0" w:lastRowLastColumn="0"/>
+        <w:rPr>
+          <w:rFonts w:ascii="Calibri" w:eastAsia="Calibri" w:hAnsi="Calibri" w:cs="Calibri"/>
+          <w:lang w:val="en-US"/>
+        </w:rPr>
+      </w:pPr>
+      <w:r>
+        <w:rPr>
+          <w:rFonts w:ascii="Calibri" w:eastAsia="Calibri" w:hAnsi="Calibri" w:cs="Calibri"/>
+          <w:lang w:val="en-US"/>
+        </w:rPr>
+        <w:t xml:space="preserve">In this step we had focused on cleaning the dataset we have selected by removing missing and duplicated values. We have also selected the values we can work on the stake holder phase </w:t>
+      </w:r>
+      <w:r>
+        <w:rPr>
+          <w:rFonts w:ascii="Calibri" w:eastAsia="Calibri" w:hAnsi="Calibri" w:cs="Calibri"/>
+          <w:lang w:val="en-US"/>
+        </w:rPr>
+        <w:t xml:space="preserve">mentioned above and here we try to make cleaning </w:t>
+      </w:r>
+      <w:r>
+        <w:rPr>
+          <w:rFonts w:ascii="Calibri" w:eastAsia="Calibri" w:hAnsi="Calibri" w:cs="Calibri"/>
+          <w:lang w:val="en-US"/>
+        </w:rPr>
+        <w:t>decisions based on that.</w:t>
+      </w:r>
+    </w:p>
+    <w:p>
+      <w:pPr>
+        <w:spacing w:line="240" w:lineRule="auto"/>
+        <w:cnfStyle w:val="001000100000" w:firstRow="0" w:lastRow="0" w:firstColumn="1" w:lastColumn="0" w:oddVBand="0" w:evenVBand="0" w:oddHBand="1" w:evenHBand="0" w:firstRowFirstColumn="0" w:firstRowLastColumn="0" w:lastRowFirstColumn="0" w:lastRowLastColumn="0"/>
+        <w:rPr>
+          <w:rFonts w:ascii="Calibri" w:eastAsia="Calibri" w:hAnsi="Calibri" w:cs="Calibri"/>
+          <w:b/>
+          <w:bCs/>
+          <w:lang w:val="en-US"/>
+        </w:rPr>
+      </w:pPr>
+      <w:r>
+        <w:rPr>
+          <w:rFonts w:ascii="Calibri" w:eastAsia="Calibri" w:hAnsi="Calibri" w:cs="Calibri"/>
+          <w:b/>
+          <w:bCs/>
+          <w:lang w:val="en-US"/>
+        </w:rPr>
+        <w:t>Missing Values</w:t>
+      </w:r>
+    </w:p>
+    <w:p>
+      <w:pPr>
+        <w:spacing w:line="240" w:lineRule="auto"/>
+        <w:cnfStyle w:val="001000100000" w:firstRow="0" w:lastRow="0" w:firstColumn="1" w:lastColumn="0" w:oddVBand="0" w:evenVBand="0" w:oddHBand="1" w:evenHBand="0" w:firstRowFirstColumn="0" w:firstRowLastColumn="0" w:lastRowFirstColumn="0" w:lastRowLastColumn="0"/>
+        <w:rPr>
+          <w:rFonts w:ascii="Calibri" w:eastAsia="Calibri" w:hAnsi="Calibri" w:cs="Calibri"/>
+          <w:lang w:val="en-US"/>
+        </w:rPr>
+      </w:pPr>
+      <w:r>
+        <w:rPr>
+          <w:rFonts w:ascii="Calibri" w:eastAsia="Calibri" w:hAnsi="Calibri" w:cs="Calibri"/>
+          <w:lang w:val="en-US"/>
+        </w:rPr>
+        <w:t>Step 1: We start by identifying the missing values in each column to know how we should deal with each of them.</w:t>
+      </w:r>
+    </w:p>
+    <w:p>
+      <w:pPr>
+        <w:spacing w:line="240" w:lineRule="auto"/>
+        <w:cnfStyle w:val="001000100000" w:firstRow="0" w:lastRow="0" w:firstColumn="1" w:lastColumn="0" w:oddVBand="0" w:evenVBand="0" w:oddHBand="1" w:evenHBand="0" w:firstRowFirstColumn="0" w:firstRowLastColumn="0" w:lastRowFirstColumn="0" w:lastRowLastColumn="0"/>
+        <w:rPr>
+          <w:rFonts w:ascii="Calibri" w:eastAsia="Calibri" w:hAnsi="Calibri" w:cs="Calibri"/>
+          <w:lang w:val="en-US"/>
+        </w:rPr>
+      </w:pPr>
+      <w:r>
+        <w:rPr>
+          <w:rFonts w:ascii="Calibri" w:eastAsia="Calibri" w:hAnsi="Calibri" w:cs="Calibri"/>
+          <w:lang w:val="en-US"/>
+        </w:rPr>
+        <w:t>Step 2: We check the number of duplicate rows</w:t>
+      </w:r>
+      <w:r>
+        <w:rPr>
+          <w:rFonts w:ascii="Calibri" w:eastAsia="Calibri" w:hAnsi="Calibri" w:cs="Calibri"/>
+          <w:lang w:val="en-US"/>
+        </w:rPr>
+        <w:t xml:space="preserve"> &amp; the summary to identify how to deal with any outliers like negative values, zero guests.</w:t>
+      </w:r>
+    </w:p>
+    <w:p>
+      <w:pPr>
+        <w:spacing w:line="240" w:lineRule="auto"/>
+        <w:cnfStyle w:val="001000100000" w:firstRow="0" w:lastRow="0" w:firstColumn="1" w:lastColumn="0" w:oddVBand="0" w:evenVBand="0" w:oddHBand="1" w:evenHBand="0" w:firstRowFirstColumn="0" w:firstRowLastColumn="0" w:lastRowFirstColumn="0" w:lastRowLastColumn="0"/>
+        <w:rPr>
+          <w:rFonts w:ascii="Calibri" w:eastAsia="Calibri" w:hAnsi="Calibri" w:cs="Calibri"/>
+          <w:lang w:val="en-US"/>
+        </w:rPr>
+      </w:pPr>
+      <w:r>
+        <w:rPr>
+          <w:rFonts w:ascii="Calibri" w:eastAsia="Calibri" w:hAnsi="Calibri" w:cs="Calibri"/>
+          <w:lang w:val="en-US"/>
+        </w:rPr>
+        <w:t xml:space="preserve">Step 3: </w:t>
+      </w:r>
+      <w:r>
+        <w:rPr>
+          <w:rFonts w:ascii="Calibri" w:eastAsia="Calibri" w:hAnsi="Calibri" w:cs="Calibri"/>
+          <w:lang w:val="en-US"/>
+        </w:rPr>
+        <w:t xml:space="preserve"> </w:t>
+      </w:r>
+      <w:r>
+        <w:rPr>
+          <w:rFonts w:ascii="Calibri" w:eastAsia="Calibri" w:hAnsi="Calibri" w:cs="Calibri"/>
+          <w:lang w:val="en-US"/>
+        </w:rPr>
+        <w:t>We create a separate table so that we have the uncleaned dataset if any important information gets lost</w:t>
+      </w:r>
+      <w:r>
+        <w:rPr>
+          <w:rFonts w:ascii="Calibri" w:eastAsia="Calibri" w:hAnsi="Calibri" w:cs="Calibri"/>
+          <w:lang w:val="en-US"/>
+        </w:rPr>
+        <w:t>.</w:t>
+      </w:r>
+    </w:p>
+    <w:p>
+      <w:pPr>
+        <w:spacing w:line="240" w:lineRule="auto"/>
+        <w:cnfStyle w:val="001000100000" w:firstRow="0" w:lastRow="0" w:firstColumn="1" w:lastColumn="0" w:oddVBand="0" w:evenVBand="0" w:oddHBand="1" w:evenHBand="0" w:firstRowFirstColumn="0" w:firstRowLastColumn="0" w:lastRowFirstColumn="0" w:lastRowLastColumn="0"/>
+        <w:rPr>
+          <w:rFonts w:ascii="Calibri" w:eastAsia="Calibri" w:hAnsi="Calibri" w:cs="Calibri"/>
+          <w:lang w:val="en-US"/>
+        </w:rPr>
+      </w:pPr>
+      <w:r>
+        <w:rPr>
+          <w:rFonts w:ascii="Calibri" w:eastAsia="Calibri" w:hAnsi="Calibri" w:cs="Calibri"/>
+          <w:lang w:val="en-US"/>
+        </w:rPr>
+        <w:t>Step 4: We associate the missing value with our key column identified is_canceled to find any association.</w:t>
+      </w:r>
+    </w:p>
+    <w:p>
+      <w:pPr>
+        <w:spacing w:line="240" w:lineRule="auto"/>
+        <w:cnfStyle w:val="001000100000" w:firstRow="0" w:lastRow="0" w:firstColumn="1" w:lastColumn="0" w:oddVBand="0" w:evenVBand="0" w:oddHBand="1" w:evenHBand="0" w:firstRowFirstColumn="0" w:firstRowLastColumn="0" w:lastRowFirstColumn="0" w:lastRowLastColumn="0"/>
+        <w:rPr>
+          <w:rFonts w:ascii="Calibri" w:eastAsia="Calibri" w:hAnsi="Calibri" w:cs="Calibri"/>
+          <w:lang w:val="en-US"/>
+        </w:rPr>
+      </w:pPr>
+      <w:r>
+        <w:rPr>
+          <w:rFonts w:ascii="Calibri" w:eastAsia="Calibri" w:hAnsi="Calibri" w:cs="Calibri"/>
+          <w:lang w:val="en-US"/>
+        </w:rPr>
+        <w:t xml:space="preserve">Step 5: We understand the data and replace the NaN values with a </w:t>
+      </w:r>
+      <w:r>
+        <w:rPr>
+          <w:rFonts w:ascii="Calibri" w:eastAsia="Calibri" w:hAnsi="Calibri" w:cs="Calibri"/>
+          <w:lang w:val="en-US"/>
+        </w:rPr>
+        <w:t>suitable value</w:t>
+      </w:r>
+      <w:r>
+        <w:rPr>
+          <w:rFonts w:ascii="Calibri" w:eastAsia="Calibri" w:hAnsi="Calibri" w:cs="Calibri"/>
+          <w:lang w:val="en-US"/>
+        </w:rPr>
+        <w:t xml:space="preserve">.             </w:t>
+      </w:r>
+      <w:r>
+        <w:rPr>
+          <w:rFonts w:ascii="Calibri" w:eastAsia="Calibri" w:hAnsi="Calibri" w:cs="Calibri"/>
+          <w:lang w:val="en-US"/>
+        </w:rPr>
+        <w:t xml:space="preserve">   </w:t>
+      </w:r>
+      <w:r>
+        <w:rPr>
+          <w:rFonts w:ascii="Calibri" w:eastAsia="Calibri" w:hAnsi="Calibri" w:cs="Calibri"/>
+          <w:lang w:val="en-US"/>
+        </w:rPr>
+        <w:t xml:space="preserve">For Example: Children </w:t>
+      </w:r>
+      <w:r>
+        <w:rPr>
+          <w:rFonts w:ascii="Calibri" w:eastAsia="Calibri" w:hAnsi="Calibri" w:cs="Calibri"/>
+          <w:lang w:val="en-US"/>
+        </w:rPr>
+        <w:t xml:space="preserve">were filled with 0 and meal was filled with Undefined. After this we check if our replacement has worked and </w:t>
+      </w:r>
+      <w:r>
+        <w:rPr>
+          <w:rFonts w:ascii="Calibri" w:eastAsia="Calibri" w:hAnsi="Calibri" w:cs="Calibri"/>
+          <w:lang w:val="en-US"/>
+        </w:rPr>
+        <w:t>there are no missing values left. Agent column had very key values with no specific pointer towards the meaning therefore we left it as it in</w:t>
+      </w:r>
+    </w:p>
+    <w:p>
+      <w:pPr>
+        <w:spacing w:line="240" w:lineRule="auto"/>
+        <w:rPr>
+          <w:rFonts w:ascii="Calibri" w:eastAsia="Calibri" w:hAnsi="Calibri" w:cs="Calibri"/>
+          <w:b/>
+          <w:bCs/>
+          <w:lang w:val="en-US"/>
+        </w:rPr>
+      </w:pPr>
+      <w:r>
+        <w:rPr>
+          <w:rFonts w:ascii="Calibri" w:eastAsia="Calibri" w:hAnsi="Calibri" w:cs="Calibri"/>
+          <w:b/>
+          <w:bCs/>
+          <w:lang w:val="en-US"/>
+        </w:rPr>
+        <w:t>Duplicate Values</w:t>
+      </w:r>
+    </w:p>
+    <w:p>
+      <w:pPr>
+        <w:spacing w:line="240" w:lineRule="auto"/>
+        <w:rPr>
+          <w:rFonts w:ascii="Calibri" w:eastAsia="Calibri" w:hAnsi="Calibri" w:cs="Calibri"/>
+          <w:lang w:val="en-US"/>
+        </w:rPr>
+      </w:pPr>
+      <w:r>
+        <w:rPr>
+          <w:rFonts w:ascii="Calibri" w:eastAsia="Calibri" w:hAnsi="Calibri" w:cs="Calibri"/>
+          <w:lang w:val="en-US"/>
+        </w:rPr>
+        <w:t xml:space="preserve">Step 1: </w:t>
+      </w:r>
+      <w:proofErr w:type="gramStart"/>
+      <w:r>
+        <w:rPr>
+          <w:rFonts w:ascii="Calibri" w:eastAsia="Calibri" w:hAnsi="Calibri" w:cs="Calibri"/>
+          <w:lang w:val="en-US"/>
+        </w:rPr>
+        <w:t>First</w:t>
+      </w:r>
+      <w:proofErr w:type="gramEnd"/>
+      <w:r>
+        <w:rPr>
+          <w:rFonts w:ascii="Calibri" w:eastAsia="Calibri" w:hAnsi="Calibri" w:cs="Calibri"/>
+          <w:lang w:val="en-US"/>
+        </w:rPr>
+        <w:t xml:space="preserve"> we started with checking the content of these values </w:t>
+      </w:r>
+      <w:proofErr w:type="gramStart"/>
+      <w:r>
+        <w:rPr>
+          <w:rFonts w:ascii="Calibri" w:eastAsia="Calibri" w:hAnsi="Calibri" w:cs="Calibri"/>
+          <w:lang w:val="en-US"/>
+        </w:rPr>
+        <w:t>to  ensure</w:t>
+      </w:r>
+      <w:proofErr w:type="gramEnd"/>
+      <w:r>
+        <w:rPr>
+          <w:rFonts w:ascii="Calibri" w:eastAsia="Calibri" w:hAnsi="Calibri" w:cs="Calibri"/>
+          <w:lang w:val="en-US"/>
+        </w:rPr>
+        <w:t xml:space="preserve"> we are not dealing with any important information that can lost.</w:t>
+      </w:r>
+      <w:r>
+        <w:rPr>
+          <w:rFonts w:ascii="Calibri" w:eastAsia="Calibri" w:hAnsi="Calibri" w:cs="Calibri"/>
+          <w:lang w:val="en-US"/>
+        </w:rPr>
+        <w:t xml:space="preserve"> We also checking with is_canceled to </w:t>
+      </w:r>
+      <w:r>
+        <w:rPr>
+          <w:rFonts w:ascii="Calibri" w:eastAsia="Calibri" w:hAnsi="Calibri" w:cs="Calibri"/>
+          <w:lang w:val="en-US"/>
+        </w:rPr>
+        <w:t>derive the importance of each row to our key column.</w:t>
+      </w:r>
+    </w:p>
+    <w:p>
+      <w:pPr>
+        <w:spacing w:line="240" w:lineRule="auto"/>
+        <w:rPr>
+          <w:rFonts w:ascii="Calibri" w:eastAsia="Calibri" w:hAnsi="Calibri" w:cs="Calibri"/>
+          <w:lang w:val="en-US"/>
+        </w:rPr>
+      </w:pPr>
+      <w:r>
+        <w:rPr>
+          <w:rFonts w:ascii="Calibri" w:eastAsia="Calibri" w:hAnsi="Calibri" w:cs="Calibri"/>
+          <w:lang w:val="en-US"/>
+        </w:rPr>
+        <w:t>Step 2: We came to a conclusion to drop all these duplicate rows and we were left with 88</w:t>
+      </w:r>
+      <w:r>
+        <w:rPr>
+          <w:rFonts w:ascii="Calibri" w:eastAsia="Calibri" w:hAnsi="Calibri" w:cs="Calibri"/>
+          <w:lang w:val="en-US"/>
+        </w:rPr>
+        <w:t>603 rows after that.</w:t>
+      </w:r>
+    </w:p>
+    <w:p>
+      <w:pPr>
+        <w:spacing w:line="240" w:lineRule="auto"/>
+        <w:rPr>
+          <w:rFonts w:ascii="Calibri" w:eastAsia="Calibri" w:hAnsi="Calibri" w:cs="Calibri"/>
+          <w:b/>
+          <w:bCs/>
+          <w:lang w:val="en-US"/>
+        </w:rPr>
+      </w:pPr>
+      <w:r>
+        <w:rPr>
+          <w:rFonts w:ascii="Calibri" w:eastAsia="Calibri" w:hAnsi="Calibri" w:cs="Calibri"/>
+          <w:b/>
+          <w:bCs/>
+          <w:lang w:val="en-US"/>
+        </w:rPr>
+        <w:t>Outliers</w:t>
+      </w:r>
+    </w:p>
+    <w:p>
+      <w:pPr>
+        <w:spacing w:line="240" w:lineRule="auto"/>
+        <w:rPr>
+          <w:rFonts w:ascii="Calibri" w:eastAsia="Calibri" w:hAnsi="Calibri" w:cs="Calibri"/>
+          <w:lang w:val="en-US"/>
+        </w:rPr>
+      </w:pPr>
+      <w:r>
+        <w:rPr>
+          <w:rFonts w:ascii="Calibri" w:eastAsia="Calibri" w:hAnsi="Calibri" w:cs="Calibri"/>
+          <w:lang w:val="en-US"/>
+        </w:rPr>
+        <w:t xml:space="preserve">Step 1: We grouped the values of each column to </w:t>
+      </w:r>
+      <w:r>
+        <w:rPr>
+          <w:rFonts w:ascii="Calibri" w:eastAsia="Calibri" w:hAnsi="Calibri" w:cs="Calibri"/>
+          <w:lang w:val="en-US"/>
+        </w:rPr>
+        <w:t xml:space="preserve">check for any variable that seem incorrect or impossible. For </w:t>
+      </w:r>
+      <w:r>
+        <w:rPr>
+          <w:rFonts w:ascii="Calibri" w:eastAsia="Calibri" w:hAnsi="Calibri" w:cs="Calibri"/>
+          <w:lang w:val="en-US"/>
+        </w:rPr>
+        <w:t>examples:</w:t>
+      </w:r>
+      <w:r>
+        <w:rPr>
+          <w:rFonts w:ascii="Calibri" w:eastAsia="Calibri" w:hAnsi="Calibri" w:cs="Calibri"/>
+          <w:lang w:val="en-US"/>
+        </w:rPr>
+        <w:t xml:space="preserve"> room having 50, 55, 40 adults seemed impossible.</w:t>
+      </w:r>
+      <w:r>
+        <w:rPr>
+          <w:rFonts w:ascii="Calibri" w:eastAsia="Calibri" w:hAnsi="Calibri" w:cs="Calibri"/>
+          <w:lang w:val="en-US"/>
+        </w:rPr>
+        <w:t xml:space="preserve"> </w:t>
+      </w:r>
+      <w:r>
+        <w:rPr>
+          <w:rFonts w:ascii="Calibri" w:eastAsia="Calibri" w:hAnsi="Calibri" w:cs="Calibri"/>
+          <w:lang w:val="en-US"/>
+        </w:rPr>
+        <w:t>Also,</w:t>
+      </w:r>
+      <w:r>
+        <w:rPr>
+          <w:rFonts w:ascii="Calibri" w:eastAsia="Calibri" w:hAnsi="Calibri" w:cs="Calibri"/>
+          <w:lang w:val="en-US"/>
+        </w:rPr>
+        <w:t xml:space="preserve"> we checked for negative values.</w:t>
+      </w:r>
+    </w:p>
+    <w:p>
+      <w:pPr>
+        <w:spacing w:line="240" w:lineRule="auto"/>
+        <w:rPr>
+          <w:rFonts w:ascii="Calibri" w:eastAsia="Calibri" w:hAnsi="Calibri" w:cs="Calibri"/>
+          <w:lang w:val="en-US"/>
+        </w:rPr>
+      </w:pPr>
+      <w:r>
+        <w:rPr>
+          <w:rFonts w:ascii="Calibri" w:eastAsia="Calibri" w:hAnsi="Calibri" w:cs="Calibri"/>
+          <w:lang w:val="en-US"/>
+        </w:rPr>
+        <w:t>Step 2:</w:t>
+      </w:r>
+      <w:r>
+        <w:rPr>
+          <w:rFonts w:ascii="Calibri" w:eastAsia="Calibri" w:hAnsi="Calibri" w:cs="Calibri"/>
+          <w:lang w:val="en-US"/>
+        </w:rPr>
+        <w:t xml:space="preserve"> We cleaning the negative values, Impossible values like children </w:t>
+      </w:r>
+      <w:r>
+        <w:rPr>
+          <w:rFonts w:ascii="Calibri" w:eastAsia="Calibri" w:hAnsi="Calibri" w:cs="Calibri"/>
+          <w:lang w:val="en-US"/>
+        </w:rPr>
+        <w:t>were 9, 10.</w:t>
+      </w:r>
+    </w:p>
+    <w:p>
+      <w:pPr>
+        <w:spacing w:line="240" w:lineRule="auto"/>
+        <w:rPr>
+          <w:rFonts w:ascii="Calibri" w:eastAsia="Calibri" w:hAnsi="Calibri" w:cs="Calibri"/>
+          <w:b/>
+          <w:bCs/>
+          <w:lang w:val="en-US"/>
+        </w:rPr>
+      </w:pPr>
+      <w:r>
+        <w:rPr>
+          <w:rFonts w:ascii="Calibri" w:eastAsia="Calibri" w:hAnsi="Calibri" w:cs="Calibri"/>
+          <w:b/>
+          <w:bCs/>
+          <w:lang w:val="en-US"/>
+        </w:rPr>
+        <w:t>Categorical Inconsis</w:t>
+      </w:r>
+      <w:r>
+        <w:rPr>
+          <w:rFonts w:ascii="Calibri" w:eastAsia="Calibri" w:hAnsi="Calibri" w:cs="Calibri"/>
+          <w:b/>
+          <w:bCs/>
+          <w:lang w:val="en-US"/>
+        </w:rPr>
+        <w:t>tency</w:t>
+      </w:r>
+    </w:p>
+    <w:p>
+      <w:pPr>
+        <w:spacing w:line="240" w:lineRule="auto"/>
+        <w:rPr>
+          <w:rFonts w:ascii="Calibri" w:eastAsia="Calibri" w:hAnsi="Calibri" w:cs="Calibri"/>
+        </w:rPr>
+      </w:pPr>
+      <w:r>
+        <w:rPr>
+          <w:rFonts w:ascii="Calibri" w:eastAsia="Calibri" w:hAnsi="Calibri" w:cs="Calibri"/>
+          <w:lang w:val="en-US"/>
+        </w:rPr>
+        <w:t xml:space="preserve">Step 1: We checking for categorical data which might be identified differently because of inconsistent </w:t>
+      </w:r>
+      <w:r>
+        <w:rPr>
+          <w:rFonts w:ascii="Calibri" w:eastAsia="Calibri" w:hAnsi="Calibri" w:cs="Calibri"/>
+          <w:lang w:val="en-US"/>
+        </w:rPr>
+        <w:t>entry</w:t>
+      </w:r>
+      <w:r>
+        <w:rPr>
+          <w:rFonts w:ascii="Calibri" w:eastAsia="Calibri" w:hAnsi="Calibri" w:cs="Calibri"/>
+          <w:lang w:val="en-US"/>
+        </w:rPr>
+        <w:t xml:space="preserve"> or format</w:t>
+      </w:r>
+      <w:r>
+        <w:rPr>
+          <w:rFonts w:ascii="Calibri" w:eastAsia="Calibri" w:hAnsi="Calibri" w:cs="Calibri"/>
+          <w:lang w:val="en-US"/>
+        </w:rPr>
+        <w:t>. Example:</w:t>
+      </w:r>
+      <w:r>
+        <w:rPr>
+          <w:rFonts w:ascii="Calibri" w:eastAsia="Calibri" w:hAnsi="Calibri" w:cs="Calibri"/>
+          <w:lang w:val="en-US"/>
+        </w:rPr>
+        <w:t xml:space="preserve"> </w:t>
+      </w:r>
+      <w:r>
+        <w:rPr>
+          <w:rFonts w:ascii="Calibri" w:eastAsia="Calibri" w:hAnsi="Calibri" w:cs="Calibri"/>
+        </w:rPr>
+        <w:t>City Hotel</w:t>
+      </w:r>
+      <w:r>
+        <w:rPr>
+          <w:rFonts w:ascii="Calibri" w:eastAsia="Calibri" w:hAnsi="Calibri" w:cs="Calibri"/>
+        </w:rPr>
+        <w:t xml:space="preserve"> &amp; </w:t>
+      </w:r>
+      <w:r>
+        <w:rPr>
+          <w:rFonts w:ascii="Calibri" w:eastAsia="Calibri" w:hAnsi="Calibri" w:cs="Calibri"/>
+        </w:rPr>
+        <w:t>CityHotel</w:t>
+      </w:r>
+      <w:r>
+        <w:rPr>
+          <w:rFonts w:ascii="Calibri" w:eastAsia="Calibri" w:hAnsi="Calibri" w:cs="Calibri"/>
+        </w:rPr>
+        <w:t xml:space="preserve">. </w:t>
+      </w:r>
+    </w:p>
+    <w:p>
+      <w:pPr>
+        <w:spacing w:line="240" w:lineRule="auto"/>
+        <w:rPr>
+          <w:rFonts w:ascii="Calibri" w:eastAsia="Calibri" w:hAnsi="Calibri" w:cs="Calibri"/>
+        </w:rPr>
+      </w:pPr>
+      <w:r>
+        <w:rPr>
+          <w:rFonts w:ascii="Calibri" w:eastAsia="Calibri" w:hAnsi="Calibri" w:cs="Calibri"/>
+        </w:rPr>
+        <w:lastRenderedPageBreak/>
+        <w:t xml:space="preserve">Step 2: After </w:t>
+      </w:r>
+      <w:r>
+        <w:rPr>
+          <w:rFonts w:ascii="Calibri" w:eastAsia="Calibri" w:hAnsi="Calibri" w:cs="Calibri"/>
+        </w:rPr>
+        <w:t>identifying we replace the values to have consistency among the data</w:t>
+      </w:r>
+      <w:r>
+        <w:rPr>
+          <w:rFonts w:ascii="Calibri" w:eastAsia="Calibri" w:hAnsi="Calibri" w:cs="Calibri"/>
+        </w:rPr>
+        <w:t>. Example:</w:t>
+      </w:r>
+      <w:r>
+        <w:rPr>
+          <w:rFonts w:ascii="Consolas" w:eastAsia="Times New Roman" w:hAnsi="Consolas" w:cs="Times New Roman"/>
+          <w:color w:val="DF6CBE"/>
+          <w:kern w:val="0"/>
+          <w:sz w:val="21"/>
+          <w:szCs w:val="21"/>
+          <w:lang w:eastAsia="en-IN"/>
+          <w14:ligatures w14:val="none"/>
+        </w:rPr>
+        <w:t xml:space="preserve"> </w:t>
+      </w:r>
+      <w:r>
+        <w:rPr>
+          <w:rFonts w:ascii="Calibri" w:eastAsia="Calibri" w:hAnsi="Calibri" w:cs="Calibri"/>
+        </w:rPr>
+        <w:t>"Direc": "Direct",</w:t>
+      </w:r>
+      <w:r>
+        <w:rPr>
+          <w:rFonts w:ascii="Calibri" w:eastAsia="Calibri" w:hAnsi="Calibri" w:cs="Calibri"/>
+        </w:rPr>
+        <w:t xml:space="preserve"> </w:t>
+      </w:r>
+      <w:r>
+        <w:rPr>
+          <w:rFonts w:ascii="Calibri" w:eastAsia="Calibri" w:hAnsi="Calibri" w:cs="Calibri"/>
+        </w:rPr>
+        <w:t>"groups": "Groups"</w:t>
+      </w:r>
+      <w:r>
+        <w:rPr>
+          <w:rFonts w:ascii="Calibri" w:eastAsia="Calibri" w:hAnsi="Calibri" w:cs="Calibri"/>
+        </w:rPr>
+        <w:t>.</w:t>
+      </w:r>
+    </w:p>
+    <w:p>
+      <w:pPr>
+        <w:spacing w:line="240" w:lineRule="auto"/>
+        <w:rPr>
+          <w:rFonts w:ascii="Calibri" w:eastAsia="Calibri" w:hAnsi="Calibri" w:cs="Calibri"/>
+        </w:rPr>
+      </w:pPr>
+      <w:r>
+        <w:rPr>
+          <w:rFonts w:ascii="Calibri" w:eastAsia="Calibri" w:hAnsi="Calibri" w:cs="Calibri"/>
+        </w:rPr>
+        <w:t xml:space="preserve">Step 3: We convert the </w:t>
+      </w:r>
+      <w:r>
+        <w:rPr>
+          <w:rFonts w:ascii="Calibri" w:eastAsia="Calibri" w:hAnsi="Calibri" w:cs="Calibri"/>
+        </w:rPr>
+        <w:t>reservation_status_date</w:t>
+      </w:r>
+      <w:r>
+        <w:rPr>
+          <w:rFonts w:ascii="Calibri" w:eastAsia="Calibri" w:hAnsi="Calibri" w:cs="Calibri"/>
+        </w:rPr>
+        <w:t xml:space="preserve"> to a consistent format</w:t>
+      </w:r>
+      <w:r>
+        <w:rPr>
+          <w:rFonts w:ascii="Calibri" w:eastAsia="Calibri" w:hAnsi="Calibri" w:cs="Calibri"/>
+        </w:rPr>
+        <w:t xml:space="preserve"> by rebuilding it from the original data</w:t>
+      </w:r>
+      <w:r>
+        <w:rPr>
+          <w:rFonts w:ascii="Calibri" w:eastAsia="Calibri" w:hAnsi="Calibri" w:cs="Calibri"/>
+        </w:rPr>
+        <w:t>.</w:t>
+      </w:r>
+    </w:p>
+    <w:p>
+      <w:pPr>
+        <w:spacing w:line="240" w:lineRule="auto"/>
+        <w:rPr>
+          <w:rFonts w:ascii="Calibri" w:eastAsia="Calibri" w:hAnsi="Calibri" w:cs="Calibri"/>
+        </w:rPr>
+      </w:pPr>
+      <w:r>
+        <w:rPr>
+          <w:rFonts w:ascii="Calibri" w:eastAsia="Calibri" w:hAnsi="Calibri" w:cs="Calibri"/>
+        </w:rPr>
+        <w:t>Step 4:</w:t>
+      </w:r>
+      <w:r>
+        <w:rPr>
+          <w:rFonts w:ascii="Calibri" w:eastAsia="Calibri" w:hAnsi="Calibri" w:cs="Calibri"/>
+        </w:rPr>
+        <w:t xml:space="preserve"> We conduct a final validation to check if we have completely cleaned the data.</w:t>
+      </w:r>
+    </w:p>
+    <w:p>
+      <w:pPr>
+        <w:spacing w:line="240" w:lineRule="auto"/>
+        <w:rPr>
+          <w:rFonts w:ascii="Calibri" w:eastAsia="Calibri" w:hAnsi="Calibri" w:cs="Calibri"/>
+        </w:rPr>
+      </w:pPr>
+      <w:r>
+        <w:rPr>
+          <w:rFonts w:ascii="Calibri" w:eastAsia="Calibri" w:hAnsi="Calibri" w:cs="Calibri"/>
+        </w:rPr>
+        <w:t>Step 5: We find some duplicate rows and that is because these rows now have consistent format which makes it easier to compare. We remove these rows.</w:t>
+      </w:r>
+    </w:p>
+    <w:p>
+      <w:pPr>
+        <w:spacing w:line="240" w:lineRule="auto"/>
+        <w:rPr>
+          <w:rFonts w:ascii="Calibri" w:eastAsia="Calibri" w:hAnsi="Calibri" w:cs="Calibri"/>
+        </w:rPr>
+      </w:pPr>
+      <w:r>
+        <w:rPr>
+          <w:rFonts w:ascii="Calibri" w:eastAsia="Calibri" w:hAnsi="Calibri" w:cs="Calibri"/>
+        </w:rPr>
+        <w:t>Pipeline</w:t>
+      </w:r>
+    </w:p>
+    <w:p>
+      <w:pPr>
+        <w:spacing w:line="240" w:lineRule="auto"/>
+        <w:rPr>
+          <w:rFonts w:ascii="Calibri" w:eastAsia="Calibri" w:hAnsi="Calibri" w:cs="Calibri"/>
+        </w:rPr>
+      </w:pPr>
+      <w:r>
+        <w:rPr>
+          <w:rFonts w:ascii="Calibri" w:eastAsia="Calibri" w:hAnsi="Calibri" w:cs="Calibri"/>
+        </w:rPr>
+        <w:t xml:space="preserve">In the end we create a cleaned dataset and conduct all the </w:t>
+      </w:r>
+      <w:r>
+        <w:rPr>
+          <w:rFonts w:ascii="Calibri" w:eastAsia="Calibri" w:hAnsi="Calibri" w:cs="Calibri"/>
+        </w:rPr>
+        <w:t>above-mentioned</w:t>
+      </w:r>
+      <w:r>
+        <w:rPr>
+          <w:rFonts w:ascii="Calibri" w:eastAsia="Calibri" w:hAnsi="Calibri" w:cs="Calibri"/>
+        </w:rPr>
+        <w:t xml:space="preserve"> steps once again to make sure we have a proper pipeline</w:t>
+      </w:r>
+      <w:r>
+        <w:rPr>
+          <w:rFonts w:ascii="Calibri" w:eastAsia="Calibri" w:hAnsi="Calibri" w:cs="Calibri"/>
+        </w:rPr>
+        <w:t xml:space="preserve">. </w:t>
+      </w:r>
+    </w:p>
+    <w:p>
+      <w:pPr>
+        <w:spacing w:line="240" w:lineRule="auto"/>
+        <w:rPr>
+          <w:rFonts w:ascii="Calibri" w:eastAsia="Calibri" w:hAnsi="Calibri" w:cs="Calibri"/>
+        </w:rPr>
+      </w:pPr>
+      <w:r>
+        <w:rPr>
+          <w:rFonts w:ascii="Calibri" w:eastAsia="Calibri" w:hAnsi="Calibri" w:cs="Calibri"/>
+        </w:rPr>
+        <w:t>Cleaned dataset saved to: hotel_bookings_cleaned.csv</w:t>
+      </w:r>
+    </w:p>
+    <w:p>
+      <w:pPr>
+        <w:spacing w:line="240" w:lineRule="auto"/>
+        <w:rPr>
+          <w:rFonts w:ascii="Calibri" w:eastAsia="Calibri" w:hAnsi="Calibri" w:cs="Calibri"/>
+        </w:rPr>
       </w:pPr>
     </w:p>
     <w:p>

</xml_diff>

<commit_message>
Report part 2 and part 4
</commit_message>
<xml_diff>
--- a/COMP5310 Assignment 1.docx
+++ b/COMP5310 Assignment 1.docx
@@ -1,6 +1,6 @@
 
 <file path=word/document.xml><?xml version="1.0" encoding="utf-8"?>
-<w:document xmlns:wpc="http://schemas.microsoft.com/office/word/2010/wordprocessingCanvas" xmlns:cx="http://schemas.microsoft.com/office/drawing/2014/chartex" xmlns:cx1="http://schemas.microsoft.com/office/drawing/2015/9/8/chartex" xmlns:cx2="http://schemas.microsoft.com/office/drawing/2015/10/21/chartex" xmlns:cx3="http://schemas.microsoft.com/office/drawing/2016/5/9/chartex" xmlns:cx4="http://schemas.microsoft.com/office/drawing/2016/5/10/chartex" xmlns:cx5="http://schemas.microsoft.com/office/drawing/2016/5/11/chartex" xmlns:cx6="http://schemas.microsoft.com/office/drawing/2016/5/12/chartex" xmlns:cx7="http://schemas.microsoft.com/office/drawing/2016/5/13/chartex" xmlns:cx8="http://schemas.microsoft.com/office/drawing/2016/5/14/chartex" xmlns:mc="http://schemas.openxmlformats.org/markup-compatibility/2006" xmlns:aink="http://schemas.microsoft.com/office/drawing/2016/ink" xmlns:am3d="http://schemas.microsoft.com/office/drawing/2017/model3d" xmlns:o="urn:schemas-microsoft-com:office:office" xmlns:oel="http://schemas.microsoft.com/office/2019/extlst" xmlns:r="http://schemas.openxmlformats.org/officeDocument/2006/relationships" xmlns:m="http://schemas.openxmlformats.org/officeDocument/2006/math" xmlns:v="urn:schemas-microsoft-com:vml" xmlns:wp14="http://schemas.microsoft.com/office/word/2010/wordprocessingDrawing" xmlns:wp="http://schemas.openxmlformats.org/drawingml/2006/wordprocessingDrawing" xmlns:w10="urn:schemas-microsoft-com:office:word" xmlns:w="http://schemas.openxmlformats.org/wordprocessingml/2006/main" xmlns:w14="http://schemas.microsoft.com/office/word/2010/wordml" xmlns:w15="http://schemas.microsoft.com/office/word/2012/wordml" xmlns:w16cex="http://schemas.microsoft.com/office/word/2018/wordml/cex" xmlns:w16cid="http://schemas.microsoft.com/office/word/2016/wordml/cid" xmlns:w16="http://schemas.microsoft.com/office/word/2018/wordml" xmlns:w16du="http://schemas.microsoft.com/office/word/2023/wordml/word16du" xmlns:w16sdtdh="http://schemas.microsoft.com/office/word/2020/wordml/sdtdatahash" xmlns:w16sdtfl="http://schemas.microsoft.com/office/word/2024/wordml/sdtformatlock" xmlns:w16se="http://schemas.microsoft.com/office/word/2015/wordml/symex" xmlns:wpg="http://schemas.microsoft.com/office/word/2010/wordprocessingGroup" xmlns:wpi="http://schemas.microsoft.com/office/word/2010/wordprocessingInk" xmlns:wne="http://schemas.microsoft.com/office/word/2006/wordml" xmlns:wps="http://schemas.microsoft.com/office/word/2010/wordprocessingShape" mc:Ignorable="w14 w15 w16se w16cid w16 w16cex w16sdtdh w16sdtfl w16du wp14">
+<w:document xmlns:wpc="http://schemas.microsoft.com/office/word/2010/wordprocessingCanvas" xmlns:cx="http://schemas.microsoft.com/office/drawing/2014/chartex" xmlns:cx1="http://schemas.microsoft.com/office/drawing/2015/9/8/chartex" xmlns:cx2="http://schemas.microsoft.com/office/drawing/2015/10/21/chartex" xmlns:cx3="http://schemas.microsoft.com/office/drawing/2016/5/9/chartex" xmlns:cx4="http://schemas.microsoft.com/office/drawing/2016/5/10/chartex" xmlns:cx5="http://schemas.microsoft.com/office/drawing/2016/5/11/chartex" xmlns:cx6="http://schemas.microsoft.com/office/drawing/2016/5/12/chartex" xmlns:cx7="http://schemas.microsoft.com/office/drawing/2016/5/13/chartex" xmlns:cx8="http://schemas.microsoft.com/office/drawing/2016/5/14/chartex" xmlns:mc="http://schemas.openxmlformats.org/markup-compatibility/2006" xmlns:m="http://schemas.openxmlformats.org/officeDocument/2006/math" xmlns:aink="http://schemas.microsoft.com/office/drawing/2016/ink" xmlns:am3d="http://schemas.microsoft.com/office/drawing/2017/model3d" xmlns:oel="http://schemas.microsoft.com/office/2019/extlst" xmlns:r="http://schemas.openxmlformats.org/officeDocument/2006/relationships" xmlns:wp14="http://schemas.microsoft.com/office/word/2010/wordprocessingDrawing" xmlns:wp="http://schemas.openxmlformats.org/drawingml/2006/wordprocessingDrawing" xmlns:wpg="http://schemas.microsoft.com/office/word/2010/wordprocessingGroup" xmlns:wpi="http://schemas.microsoft.com/office/word/2010/wordprocessingInk" xmlns:wps="http://schemas.microsoft.com/office/word/2010/wordprocessingShape" xmlns:o="urn:schemas-microsoft-com:office:office" xmlns:v="urn:schemas-microsoft-com:vml" xmlns:w10="urn:schemas-microsoft-com:office:word" xmlns:w="http://schemas.openxmlformats.org/wordprocessingml/2006/main" xmlns:w14="http://schemas.microsoft.com/office/word/2010/wordml" xmlns:w15="http://schemas.microsoft.com/office/word/2012/wordml" xmlns:w16cex="http://schemas.microsoft.com/office/word/2018/wordml/cex" xmlns:w16cid="http://schemas.microsoft.com/office/word/2016/wordml/cid" xmlns:w16="http://schemas.microsoft.com/office/word/2018/wordml" xmlns:w16sdtdh="http://schemas.microsoft.com/office/word/2020/wordml/sdtdatahash" xmlns:w16sdtfl="http://schemas.microsoft.com/office/word/2024/wordml/sdtformatlock" xmlns:w16se="http://schemas.microsoft.com/office/word/2015/wordml/symex" xmlns:w16du="http://schemas.microsoft.com/office/word/2023/wordml/word16du" xmlns:wne="http://schemas.microsoft.com/office/word/2006/wordml" mc:Ignorable="w14 w15 w16se w16cid w16 w16cex w16sdtdh w16sdtfl w16du wp14">
   <w:body>
     <w:p/>
     <w:p/>
@@ -503,21 +503,7 @@
                 <w:rFonts w:ascii="Calibri" w:eastAsia="Calibri" w:hAnsi="Calibri" w:cs="Calibri"/>
                 <w:lang w:val="en-US"/>
               </w:rPr>
-              <w:t>Yanjun Zhu</w:t>
-            </w:r>
-            <w:r>
-              <w:rPr>
-                <w:rFonts w:ascii="Calibri" w:eastAsia="Calibri" w:hAnsi="Calibri" w:cs="Calibri"/>
-                <w:lang w:val="en-US"/>
-              </w:rPr>
-              <w:t xml:space="preserve"> &amp; </w:t>
-            </w:r>
-            <w:r>
-              <w:rPr>
-                <w:rFonts w:ascii="Calibri" w:eastAsia="Calibri" w:hAnsi="Calibri" w:cs="Calibri"/>
-                <w:lang w:val="en-US"/>
-              </w:rPr>
-              <w:t>Sia Kaur Tervinder Singh Duggal</w:t>
+              <w:t>Yanjun Zhu &amp; Sia Kaur Tervinder Singh Duggal</w:t>
             </w:r>
           </w:p>
         </w:tc>
@@ -852,21 +838,7 @@
         <w:rPr>
           <w:rFonts w:ascii="Calibri" w:eastAsia="Calibri" w:hAnsi="Calibri" w:cs="Calibri"/>
         </w:rPr>
-        <w:t xml:space="preserve">Step 1: First, we conducted the basic tests such as checking the content of the </w:t>
-      </w:r>
-      <w:proofErr w:type="gramStart"/>
-      <w:r>
-        <w:rPr>
-          <w:rFonts w:ascii="Calibri" w:eastAsia="Calibri" w:hAnsi="Calibri" w:cs="Calibri"/>
-        </w:rPr>
-        <w:t>dataset ,</w:t>
-      </w:r>
-      <w:proofErr w:type="gramEnd"/>
-      <w:r>
-        <w:rPr>
-          <w:rFonts w:ascii="Calibri" w:eastAsia="Calibri" w:hAnsi="Calibri" w:cs="Calibri"/>
-        </w:rPr>
-        <w:t xml:space="preserve"> variables and the describe function. We conducted this step for all to know our dataset and also have some clarity.</w:t>
+        <w:t>Step 1: First, we conducted the basic tests such as checking the content of the dataset , variables and the describe function. We conducted this step for all to know our dataset and also have some clarity.</w:t>
       </w:r>
     </w:p>
     <w:p>
@@ -894,21 +866,7 @@
         <w:rPr>
           <w:rFonts w:ascii="Calibri" w:eastAsia="Calibri" w:hAnsi="Calibri" w:cs="Calibri"/>
         </w:rPr>
-        <w:t xml:space="preserve">Step 3: Making a summary table with important content like categorical </w:t>
-      </w:r>
-      <w:proofErr w:type="gramStart"/>
-      <w:r>
-        <w:rPr>
-          <w:rFonts w:ascii="Calibri" w:eastAsia="Calibri" w:hAnsi="Calibri" w:cs="Calibri"/>
-        </w:rPr>
-        <w:t>data ,</w:t>
-      </w:r>
-      <w:proofErr w:type="gramEnd"/>
-      <w:r>
-        <w:rPr>
-          <w:rFonts w:ascii="Calibri" w:eastAsia="Calibri" w:hAnsi="Calibri" w:cs="Calibri"/>
-        </w:rPr>
-        <w:t xml:space="preserve"> missing data, duplicate data, numerical data</w:t>
+        <w:t>Step 3: Making a summary table with important content like categorical data , missing data, duplicate data, numerical data</w:t>
       </w:r>
     </w:p>
     <w:p>
@@ -2142,24 +2100,168 @@
     </w:p>
     <w:p>
       <w:pPr>
-        <w:spacing w:line="240" w:lineRule="auto"/>
-      </w:pPr>
-    </w:p>
-    <w:p>
-      <w:pPr>
-        <w:spacing w:line="240" w:lineRule="auto"/>
-      </w:pPr>
-    </w:p>
-    <w:p>
-      <w:pPr>
-        <w:spacing w:line="240" w:lineRule="auto"/>
-      </w:pPr>
-    </w:p>
-    <w:p>
-      <w:pPr>
-        <w:spacing w:line="240" w:lineRule="auto"/>
+        <w:keepNext/>
+        <w:spacing w:before="200" w:after="120" w:line="240" w:lineRule="auto"/>
         <w:jc w:val="center"/>
-        <w:cnfStyle w:val="001000100000" w:firstRow="0" w:lastRow="0" w:firstColumn="1" w:lastColumn="0" w:oddVBand="0" w:evenVBand="0" w:oddHBand="1" w:evenHBand="0" w:firstRowFirstColumn="0" w:firstRowLastColumn="0" w:lastRowFirstColumn="0" w:lastRowLastColumn="0"/>
+      </w:pPr>
+      <w:r>
+        <w:rPr>
+          <w:b/>
+          <w:color w:val="000000"/>
+          <w:sz w:val="30"/>
+        </w:rPr>
+        <w:lastRenderedPageBreak/>
+        <w:t>2. Stakeholder Problem and Success Criteria</w:t>
+      </w:r>
+    </w:p>
+    <w:p>
+      <w:pPr>
+        <w:pStyle w:val="Heading2"/>
+        <w:spacing w:after="60" w:line="240" w:lineRule="auto"/>
+      </w:pPr>
+      <w:r>
+        <w:rPr>
+          <w:color w:val="000000"/>
+          <w:sz w:val="26"/>
+        </w:rPr>
+        <w:t>2.1 Stakeholder and decision</w:t>
+      </w:r>
+    </w:p>
+    <w:p>
+      <w:r>
+        <w:t>The primary stakeholder is the hotel’s revenue or reservations manager, who manages room availability, cancellation risk, occupancy and pricing. The concrete decision is whether a future booking has enough cancellation risk to justify an intervention, such as a confirmation reminder, deposit request, flexible rebooking offer, manual review or adjustment to overbooking limits. This matters because a late-cancelled room may not be resold, while unnecessary intervention may inconvenience reliable guests and damage trust.</w:t>
+      </w:r>
+    </w:p>
+    <w:p>
+      <w:pPr>
+        <w:pStyle w:val="Heading2"/>
+        <w:spacing w:after="60" w:line="240" w:lineRule="auto"/>
+      </w:pPr>
+      <w:r>
+        <w:rPr>
+          <w:color w:val="000000"/>
+          <w:sz w:val="26"/>
+        </w:rPr>
+        <w:t>2.2 Focused business question and target</w:t>
+      </w:r>
+    </w:p>
+    <w:p>
+      <w:r>
+        <w:t>In the dataset, 44,448 of 119,987 bookings were cancelled, an overall rate of approximately 37.0%. The focused question is:</w:t>
+      </w:r>
+    </w:p>
+    <w:p>
+      <w:pPr>
+        <w:spacing w:before="40" w:after="120"/>
+        <w:ind w:left="504" w:right="360"/>
+      </w:pPr>
+      <w:r>
+        <w:rPr>
+          <w:i/>
+        </w:rPr>
+        <w:t>Using information available before the scheduled arrival, which bookings are most likely to be cancelled, and how can the hotel use the estimated risk to target cancellation-management actions?</w:t>
+      </w:r>
+    </w:p>
+    <w:p>
+      <w:r>
+        <w:t xml:space="preserve">The unit of analysis is an individual booking and the binary target is </w:t>
+      </w:r>
+      <w:proofErr w:type="spellStart"/>
+      <w:r>
+        <w:rPr>
+          <w:rFonts w:ascii="Consolas" w:hAnsi="Consolas"/>
+          <w:sz w:val="19"/>
+        </w:rPr>
+        <w:t>is_canceled</w:t>
+      </w:r>
+      <w:proofErr w:type="spellEnd"/>
+      <w:r>
+        <w:t xml:space="preserve"> (1 = cancelled; 0 = not cancelled). The analysis will first identify characteristics associated with cancellation and, in Assignment 2, estimate a cancellation probability for each future booking. Candidate predictors include lead time, hotel and customer type, market segment, distribution channel, deposit type, previous cancellations, repeated-guest status, ADR, parking requirements and special requests. </w:t>
+      </w:r>
+      <w:proofErr w:type="spellStart"/>
+      <w:r>
+        <w:rPr>
+          <w:rFonts w:ascii="Consolas" w:hAnsi="Consolas"/>
+          <w:sz w:val="19"/>
+        </w:rPr>
+        <w:t>reservation_status</w:t>
+      </w:r>
+      <w:proofErr w:type="spellEnd"/>
+      <w:r>
+        <w:t xml:space="preserve"> and </w:t>
+      </w:r>
+      <w:proofErr w:type="spellStart"/>
+      <w:r>
+        <w:rPr>
+          <w:rFonts w:ascii="Consolas" w:hAnsi="Consolas"/>
+          <w:sz w:val="19"/>
+        </w:rPr>
+        <w:t>reservation_status_date</w:t>
+      </w:r>
+      <w:proofErr w:type="spellEnd"/>
+      <w:r>
+        <w:t xml:space="preserve"> must be excluded because they reveal the outcome and would cause target leakage.</w:t>
+      </w:r>
+    </w:p>
+    <w:p>
+      <w:pPr>
+        <w:pStyle w:val="Heading2"/>
+        <w:spacing w:after="60" w:line="240" w:lineRule="auto"/>
+      </w:pPr>
+      <w:r>
+        <w:rPr>
+          <w:color w:val="000000"/>
+          <w:sz w:val="26"/>
+        </w:rPr>
+        <w:t>2.3 Intended outcome and success criteria</w:t>
+      </w:r>
+    </w:p>
+    <w:p>
+      <w:r>
+        <w:t>The intended outcome is an interpretable risk score that lets the manager rank upcoming bookings or classify them as low, medium or high risk. The action threshold should reflect intervention capacity and the relative cost of errors. A useful answer should perform reliably on unseen, later bookings; produce reasonably calibrated probabilities; and provide a practical balance between recall and precision at the selected threshold. ROC-AUC or PR-AUC can assess ranking, while a confusion matrix and a cost comparison can show the operational effect of false positives and false negatives. Accuracy alone is not sufficient because predicting every booking as “not cancelled” would already be about 63% accurate while detecting no cancellations.</w:t>
+      </w:r>
+    </w:p>
+    <w:p>
+      <w:pPr>
+        <w:pStyle w:val="Heading2"/>
+        <w:spacing w:after="60" w:line="240" w:lineRule="auto"/>
+      </w:pPr>
+      <w:r>
+        <w:rPr>
+          <w:color w:val="000000"/>
+          <w:sz w:val="26"/>
+        </w:rPr>
+        <w:t>2.4 Cost of a misleading conclusion</w:t>
+      </w:r>
+    </w:p>
+    <w:p>
+      <w:r>
+        <w:t xml:space="preserve">A false negative may leave a late-cancelled room unsold, reducing revenue and occupancy and causing the manager to set an insufficient overbooking allowance. A false positive may trigger unnecessary messages, deposits, reviews or aggressive overbooking for a reliable guest, creating inconvenience, compensation costs and reputational harm. Correlations must </w:t>
+      </w:r>
+      <w:r>
+        <w:lastRenderedPageBreak/>
+        <w:t>also not be treated as causes: for example, a market-segment effect may partly reflect lead time, deposit type, season or distribution channel. The final recommendation should therefore use unseen data, check leakage and calibration, compare against a baseline, and translate prediction errors into estimated business costs.</w:t>
+      </w:r>
+    </w:p>
+    <w:p>
+      <w:pPr>
+        <w:spacing w:line="240" w:lineRule="auto"/>
+      </w:pPr>
+    </w:p>
+    <w:p>
+      <w:pPr>
+        <w:spacing w:line="240" w:lineRule="auto"/>
+      </w:pPr>
+    </w:p>
+    <w:p>
+      <w:pPr>
+        <w:spacing w:line="240" w:lineRule="auto"/>
+      </w:pPr>
+    </w:p>
+    <w:p>
+      <w:pPr>
+        <w:spacing w:line="240" w:lineRule="auto"/>
+        <w:jc w:val="center"/>
         <w:rPr>
           <w:rFonts w:ascii="Calibri" w:eastAsia="Calibri" w:hAnsi="Calibri" w:cs="Calibri"/>
           <w:b/>
@@ -2181,480 +2283,472 @@
           <w:bCs/>
           <w:lang w:val="en-US"/>
         </w:rPr>
-        <w:t xml:space="preserve"> </w:t>
-      </w:r>
-      <w:r>
+        <w:t xml:space="preserve"> Data-Readiness Pipeline</w:t>
+      </w:r>
+    </w:p>
+    <w:p>
+      <w:pPr>
+        <w:spacing w:line="240" w:lineRule="auto"/>
+        <w:jc w:val="center"/>
         <w:rPr>
           <w:rFonts w:ascii="Calibri" w:eastAsia="Calibri" w:hAnsi="Calibri" w:cs="Calibri"/>
           <w:b/>
           <w:bCs/>
           <w:lang w:val="en-US"/>
         </w:rPr>
-        <w:t>Data-Readiness Pipeline</w:t>
-      </w:r>
-    </w:p>
-    <w:p>
-      <w:pPr>
-        <w:spacing w:line="240" w:lineRule="auto"/>
-        <w:jc w:val="center"/>
-        <w:cnfStyle w:val="001000100000" w:firstRow="0" w:lastRow="0" w:firstColumn="1" w:lastColumn="0" w:oddVBand="0" w:evenVBand="0" w:oddHBand="1" w:evenHBand="0" w:firstRowFirstColumn="0" w:firstRowLastColumn="0" w:lastRowFirstColumn="0" w:lastRowLastColumn="0"/>
+      </w:pPr>
+    </w:p>
+    <w:p>
+      <w:pPr>
+        <w:spacing w:line="240" w:lineRule="auto"/>
         <w:rPr>
           <w:rFonts w:ascii="Calibri" w:eastAsia="Calibri" w:hAnsi="Calibri" w:cs="Calibri"/>
           <w:b/>
           <w:bCs/>
-          <w:lang w:val="en-US"/>
-        </w:rPr>
-      </w:pPr>
-    </w:p>
-    <w:p>
-      <w:pPr>
-        <w:spacing w:line="240" w:lineRule="auto"/>
-        <w:cnfStyle w:val="001000100000" w:firstRow="0" w:lastRow="0" w:firstColumn="1" w:lastColumn="0" w:oddVBand="0" w:evenVBand="0" w:oddHBand="1" w:evenHBand="0" w:firstRowFirstColumn="0" w:firstRowLastColumn="0" w:lastRowFirstColumn="0" w:lastRowLastColumn="0"/>
+        </w:rPr>
+      </w:pPr>
+      <w:r>
         <w:rPr>
           <w:rFonts w:ascii="Calibri" w:eastAsia="Calibri" w:hAnsi="Calibri" w:cs="Calibri"/>
           <w:b/>
           <w:bCs/>
         </w:rPr>
-      </w:pPr>
-      <w:r>
+        <w:t>Data Quality Audit</w:t>
+      </w:r>
+    </w:p>
+    <w:p>
+      <w:pPr>
+        <w:spacing w:line="240" w:lineRule="auto"/>
+        <w:rPr>
+          <w:rFonts w:ascii="Calibri" w:eastAsia="Calibri" w:hAnsi="Calibri" w:cs="Calibri"/>
+          <w:lang w:val="en-US"/>
+        </w:rPr>
+      </w:pPr>
+      <w:r>
+        <w:rPr>
+          <w:rFonts w:ascii="Calibri" w:eastAsia="Calibri" w:hAnsi="Calibri" w:cs="Calibri"/>
+          <w:lang w:val="en-US"/>
+        </w:rPr>
+        <w:t xml:space="preserve">In this step we had focused on cleaning the dataset we have selected by removing missing and duplicated values. We have also selected the values we can work on the stake holder phase </w:t>
+      </w:r>
+      <w:r>
+        <w:rPr>
+          <w:rFonts w:ascii="Calibri" w:eastAsia="Calibri" w:hAnsi="Calibri" w:cs="Calibri"/>
+          <w:lang w:val="en-US"/>
+        </w:rPr>
+        <w:t xml:space="preserve">mentioned above and here we try to make cleaning </w:t>
+      </w:r>
+      <w:r>
+        <w:rPr>
+          <w:rFonts w:ascii="Calibri" w:eastAsia="Calibri" w:hAnsi="Calibri" w:cs="Calibri"/>
+          <w:lang w:val="en-US"/>
+        </w:rPr>
+        <w:t>decisions based on that.</w:t>
+      </w:r>
+    </w:p>
+    <w:p>
+      <w:pPr>
+        <w:spacing w:line="240" w:lineRule="auto"/>
         <w:rPr>
           <w:rFonts w:ascii="Calibri" w:eastAsia="Calibri" w:hAnsi="Calibri" w:cs="Calibri"/>
           <w:b/>
           <w:bCs/>
-        </w:rPr>
-        <w:t>Data Quality Audit</w:t>
-      </w:r>
-    </w:p>
-    <w:p>
-      <w:pPr>
-        <w:spacing w:line="240" w:lineRule="auto"/>
-        <w:cnfStyle w:val="001000100000" w:firstRow="0" w:lastRow="0" w:firstColumn="1" w:lastColumn="0" w:oddVBand="0" w:evenVBand="0" w:oddHBand="1" w:evenHBand="0" w:firstRowFirstColumn="0" w:firstRowLastColumn="0" w:lastRowFirstColumn="0" w:lastRowLastColumn="0"/>
-        <w:rPr>
-          <w:rFonts w:ascii="Calibri" w:eastAsia="Calibri" w:hAnsi="Calibri" w:cs="Calibri"/>
-          <w:lang w:val="en-US"/>
-        </w:rPr>
-      </w:pPr>
-      <w:r>
-        <w:rPr>
-          <w:rFonts w:ascii="Calibri" w:eastAsia="Calibri" w:hAnsi="Calibri" w:cs="Calibri"/>
-          <w:lang w:val="en-US"/>
-        </w:rPr>
-        <w:t xml:space="preserve">In this step we had focused on cleaning the dataset we have selected by removing missing and duplicated values. We have also selected the values we can work on the stake holder phase </w:t>
-      </w:r>
-      <w:r>
-        <w:rPr>
-          <w:rFonts w:ascii="Calibri" w:eastAsia="Calibri" w:hAnsi="Calibri" w:cs="Calibri"/>
-          <w:lang w:val="en-US"/>
-        </w:rPr>
-        <w:t xml:space="preserve">mentioned above and here we try to make cleaning </w:t>
-      </w:r>
-      <w:r>
-        <w:rPr>
-          <w:rFonts w:ascii="Calibri" w:eastAsia="Calibri" w:hAnsi="Calibri" w:cs="Calibri"/>
-          <w:lang w:val="en-US"/>
-        </w:rPr>
-        <w:t>decisions based on that.</w:t>
-      </w:r>
-    </w:p>
-    <w:p>
-      <w:pPr>
-        <w:spacing w:line="240" w:lineRule="auto"/>
-        <w:cnfStyle w:val="001000100000" w:firstRow="0" w:lastRow="0" w:firstColumn="1" w:lastColumn="0" w:oddVBand="0" w:evenVBand="0" w:oddHBand="1" w:evenHBand="0" w:firstRowFirstColumn="0" w:firstRowLastColumn="0" w:lastRowFirstColumn="0" w:lastRowLastColumn="0"/>
+          <w:lang w:val="en-US"/>
+        </w:rPr>
+      </w:pPr>
+      <w:r>
         <w:rPr>
           <w:rFonts w:ascii="Calibri" w:eastAsia="Calibri" w:hAnsi="Calibri" w:cs="Calibri"/>
           <w:b/>
           <w:bCs/>
           <w:lang w:val="en-US"/>
         </w:rPr>
-      </w:pPr>
-      <w:r>
+        <w:t>Missing Values</w:t>
+      </w:r>
+    </w:p>
+    <w:p>
+      <w:pPr>
+        <w:spacing w:line="240" w:lineRule="auto"/>
+        <w:rPr>
+          <w:rFonts w:ascii="Calibri" w:eastAsia="Calibri" w:hAnsi="Calibri" w:cs="Calibri"/>
+          <w:lang w:val="en-US"/>
+        </w:rPr>
+      </w:pPr>
+      <w:r>
+        <w:rPr>
+          <w:rFonts w:ascii="Calibri" w:eastAsia="Calibri" w:hAnsi="Calibri" w:cs="Calibri"/>
+          <w:lang w:val="en-US"/>
+        </w:rPr>
+        <w:t>Step 1: We start by identifying the missing values in each column to know how we should deal with each of them.</w:t>
+      </w:r>
+    </w:p>
+    <w:p>
+      <w:pPr>
+        <w:spacing w:line="240" w:lineRule="auto"/>
+        <w:rPr>
+          <w:rFonts w:ascii="Calibri" w:eastAsia="Calibri" w:hAnsi="Calibri" w:cs="Calibri"/>
+          <w:lang w:val="en-US"/>
+        </w:rPr>
+      </w:pPr>
+      <w:r>
+        <w:rPr>
+          <w:rFonts w:ascii="Calibri" w:eastAsia="Calibri" w:hAnsi="Calibri" w:cs="Calibri"/>
+          <w:lang w:val="en-US"/>
+        </w:rPr>
+        <w:t>Step 2: We check the number of duplicate rows</w:t>
+      </w:r>
+      <w:r>
+        <w:rPr>
+          <w:rFonts w:ascii="Calibri" w:eastAsia="Calibri" w:hAnsi="Calibri" w:cs="Calibri"/>
+          <w:lang w:val="en-US"/>
+        </w:rPr>
+        <w:t xml:space="preserve"> &amp; the summary to identify how to deal with any outliers like negative values, zero guests.</w:t>
+      </w:r>
+    </w:p>
+    <w:p>
+      <w:pPr>
+        <w:spacing w:line="240" w:lineRule="auto"/>
+        <w:rPr>
+          <w:rFonts w:ascii="Calibri" w:eastAsia="Calibri" w:hAnsi="Calibri" w:cs="Calibri"/>
+          <w:lang w:val="en-US"/>
+        </w:rPr>
+      </w:pPr>
+      <w:r>
+        <w:rPr>
+          <w:rFonts w:ascii="Calibri" w:eastAsia="Calibri" w:hAnsi="Calibri" w:cs="Calibri"/>
+          <w:lang w:val="en-US"/>
+        </w:rPr>
+        <w:t xml:space="preserve">Step 3: </w:t>
+      </w:r>
+      <w:r>
+        <w:rPr>
+          <w:rFonts w:ascii="Calibri" w:eastAsia="Calibri" w:hAnsi="Calibri" w:cs="Calibri"/>
+          <w:lang w:val="en-US"/>
+        </w:rPr>
+        <w:t xml:space="preserve"> </w:t>
+      </w:r>
+      <w:r>
+        <w:rPr>
+          <w:rFonts w:ascii="Calibri" w:eastAsia="Calibri" w:hAnsi="Calibri" w:cs="Calibri"/>
+          <w:lang w:val="en-US"/>
+        </w:rPr>
+        <w:t>We create a separate table so that we have the uncleaned dataset if any important information gets lost</w:t>
+      </w:r>
+      <w:r>
+        <w:rPr>
+          <w:rFonts w:ascii="Calibri" w:eastAsia="Calibri" w:hAnsi="Calibri" w:cs="Calibri"/>
+          <w:lang w:val="en-US"/>
+        </w:rPr>
+        <w:t>.</w:t>
+      </w:r>
+    </w:p>
+    <w:p>
+      <w:pPr>
+        <w:spacing w:line="240" w:lineRule="auto"/>
+        <w:rPr>
+          <w:rFonts w:ascii="Calibri" w:eastAsia="Calibri" w:hAnsi="Calibri" w:cs="Calibri"/>
+          <w:lang w:val="en-US"/>
+        </w:rPr>
+      </w:pPr>
+      <w:r>
+        <w:rPr>
+          <w:rFonts w:ascii="Calibri" w:eastAsia="Calibri" w:hAnsi="Calibri" w:cs="Calibri"/>
+          <w:lang w:val="en-US"/>
+        </w:rPr>
+        <w:t>Step 4: We associate the missing value with our key column identified is_canceled to find any association.</w:t>
+      </w:r>
+    </w:p>
+    <w:p>
+      <w:pPr>
+        <w:spacing w:line="240" w:lineRule="auto"/>
+        <w:rPr>
+          <w:rFonts w:ascii="Calibri" w:eastAsia="Calibri" w:hAnsi="Calibri" w:cs="Calibri"/>
+          <w:lang w:val="en-US"/>
+        </w:rPr>
+      </w:pPr>
+      <w:r>
+        <w:rPr>
+          <w:rFonts w:ascii="Calibri" w:eastAsia="Calibri" w:hAnsi="Calibri" w:cs="Calibri"/>
+          <w:lang w:val="en-US"/>
+        </w:rPr>
+        <w:t xml:space="preserve">Step 5: We understand the data and replace the NaN values with a </w:t>
+      </w:r>
+      <w:r>
+        <w:rPr>
+          <w:rFonts w:ascii="Calibri" w:eastAsia="Calibri" w:hAnsi="Calibri" w:cs="Calibri"/>
+          <w:lang w:val="en-US"/>
+        </w:rPr>
+        <w:t>suitable value</w:t>
+      </w:r>
+      <w:r>
+        <w:rPr>
+          <w:rFonts w:ascii="Calibri" w:eastAsia="Calibri" w:hAnsi="Calibri" w:cs="Calibri"/>
+          <w:lang w:val="en-US"/>
+        </w:rPr>
+        <w:t xml:space="preserve">.             </w:t>
+      </w:r>
+      <w:r>
+        <w:rPr>
+          <w:rFonts w:ascii="Calibri" w:eastAsia="Calibri" w:hAnsi="Calibri" w:cs="Calibri"/>
+          <w:lang w:val="en-US"/>
+        </w:rPr>
+        <w:t xml:space="preserve">   </w:t>
+      </w:r>
+      <w:r>
+        <w:rPr>
+          <w:rFonts w:ascii="Calibri" w:eastAsia="Calibri" w:hAnsi="Calibri" w:cs="Calibri"/>
+          <w:lang w:val="en-US"/>
+        </w:rPr>
+        <w:t xml:space="preserve">For Example: Children </w:t>
+      </w:r>
+      <w:r>
+        <w:rPr>
+          <w:rFonts w:ascii="Calibri" w:eastAsia="Calibri" w:hAnsi="Calibri" w:cs="Calibri"/>
+          <w:lang w:val="en-US"/>
+        </w:rPr>
+        <w:t xml:space="preserve">were filled with 0 and meal was filled with Undefined. After this we check if our replacement has worked and </w:t>
+      </w:r>
+      <w:r>
+        <w:rPr>
+          <w:rFonts w:ascii="Calibri" w:eastAsia="Calibri" w:hAnsi="Calibri" w:cs="Calibri"/>
+          <w:lang w:val="en-US"/>
+        </w:rPr>
+        <w:t>there are no missing values left. Agent column had very key values with no specific pointer towards the meaning therefore we left it as it in</w:t>
+      </w:r>
+    </w:p>
+    <w:p>
+      <w:pPr>
+        <w:spacing w:line="240" w:lineRule="auto"/>
         <w:rPr>
           <w:rFonts w:ascii="Calibri" w:eastAsia="Calibri" w:hAnsi="Calibri" w:cs="Calibri"/>
           <w:b/>
           <w:bCs/>
           <w:lang w:val="en-US"/>
         </w:rPr>
-        <w:t>Missing Values</w:t>
-      </w:r>
-    </w:p>
-    <w:p>
-      <w:pPr>
-        <w:spacing w:line="240" w:lineRule="auto"/>
-        <w:cnfStyle w:val="001000100000" w:firstRow="0" w:lastRow="0" w:firstColumn="1" w:lastColumn="0" w:oddVBand="0" w:evenVBand="0" w:oddHBand="1" w:evenHBand="0" w:firstRowFirstColumn="0" w:firstRowLastColumn="0" w:lastRowFirstColumn="0" w:lastRowLastColumn="0"/>
-        <w:rPr>
-          <w:rFonts w:ascii="Calibri" w:eastAsia="Calibri" w:hAnsi="Calibri" w:cs="Calibri"/>
-          <w:lang w:val="en-US"/>
-        </w:rPr>
-      </w:pPr>
-      <w:r>
-        <w:rPr>
-          <w:rFonts w:ascii="Calibri" w:eastAsia="Calibri" w:hAnsi="Calibri" w:cs="Calibri"/>
-          <w:lang w:val="en-US"/>
-        </w:rPr>
-        <w:t>Step 1: We start by identifying the missing values in each column to know how we should deal with each of them.</w:t>
-      </w:r>
-    </w:p>
-    <w:p>
-      <w:pPr>
-        <w:spacing w:line="240" w:lineRule="auto"/>
-        <w:cnfStyle w:val="001000100000" w:firstRow="0" w:lastRow="0" w:firstColumn="1" w:lastColumn="0" w:oddVBand="0" w:evenVBand="0" w:oddHBand="1" w:evenHBand="0" w:firstRowFirstColumn="0" w:firstRowLastColumn="0" w:lastRowFirstColumn="0" w:lastRowLastColumn="0"/>
-        <w:rPr>
-          <w:rFonts w:ascii="Calibri" w:eastAsia="Calibri" w:hAnsi="Calibri" w:cs="Calibri"/>
-          <w:lang w:val="en-US"/>
-        </w:rPr>
-      </w:pPr>
-      <w:r>
-        <w:rPr>
-          <w:rFonts w:ascii="Calibri" w:eastAsia="Calibri" w:hAnsi="Calibri" w:cs="Calibri"/>
-          <w:lang w:val="en-US"/>
-        </w:rPr>
-        <w:t>Step 2: We check the number of duplicate rows</w:t>
-      </w:r>
-      <w:r>
-        <w:rPr>
-          <w:rFonts w:ascii="Calibri" w:eastAsia="Calibri" w:hAnsi="Calibri" w:cs="Calibri"/>
-          <w:lang w:val="en-US"/>
-        </w:rPr>
-        <w:t xml:space="preserve"> &amp; the summary to identify how to deal with any outliers like negative values, zero guests.</w:t>
-      </w:r>
-    </w:p>
-    <w:p>
-      <w:pPr>
-        <w:spacing w:line="240" w:lineRule="auto"/>
-        <w:cnfStyle w:val="001000100000" w:firstRow="0" w:lastRow="0" w:firstColumn="1" w:lastColumn="0" w:oddVBand="0" w:evenVBand="0" w:oddHBand="1" w:evenHBand="0" w:firstRowFirstColumn="0" w:firstRowLastColumn="0" w:lastRowFirstColumn="0" w:lastRowLastColumn="0"/>
-        <w:rPr>
-          <w:rFonts w:ascii="Calibri" w:eastAsia="Calibri" w:hAnsi="Calibri" w:cs="Calibri"/>
-          <w:lang w:val="en-US"/>
-        </w:rPr>
-      </w:pPr>
-      <w:r>
-        <w:rPr>
-          <w:rFonts w:ascii="Calibri" w:eastAsia="Calibri" w:hAnsi="Calibri" w:cs="Calibri"/>
-          <w:lang w:val="en-US"/>
-        </w:rPr>
-        <w:t xml:space="preserve">Step 3: </w:t>
-      </w:r>
-      <w:r>
-        <w:rPr>
-          <w:rFonts w:ascii="Calibri" w:eastAsia="Calibri" w:hAnsi="Calibri" w:cs="Calibri"/>
-          <w:lang w:val="en-US"/>
-        </w:rPr>
-        <w:t xml:space="preserve"> </w:t>
-      </w:r>
-      <w:r>
-        <w:rPr>
-          <w:rFonts w:ascii="Calibri" w:eastAsia="Calibri" w:hAnsi="Calibri" w:cs="Calibri"/>
-          <w:lang w:val="en-US"/>
-        </w:rPr>
-        <w:t>We create a separate table so that we have the uncleaned dataset if any important information gets lost</w:t>
-      </w:r>
-      <w:r>
-        <w:rPr>
-          <w:rFonts w:ascii="Calibri" w:eastAsia="Calibri" w:hAnsi="Calibri" w:cs="Calibri"/>
-          <w:lang w:val="en-US"/>
-        </w:rPr>
-        <w:t>.</w:t>
-      </w:r>
-    </w:p>
-    <w:p>
-      <w:pPr>
-        <w:spacing w:line="240" w:lineRule="auto"/>
-        <w:cnfStyle w:val="001000100000" w:firstRow="0" w:lastRow="0" w:firstColumn="1" w:lastColumn="0" w:oddVBand="0" w:evenVBand="0" w:oddHBand="1" w:evenHBand="0" w:firstRowFirstColumn="0" w:firstRowLastColumn="0" w:lastRowFirstColumn="0" w:lastRowLastColumn="0"/>
-        <w:rPr>
-          <w:rFonts w:ascii="Calibri" w:eastAsia="Calibri" w:hAnsi="Calibri" w:cs="Calibri"/>
-          <w:lang w:val="en-US"/>
-        </w:rPr>
-      </w:pPr>
-      <w:r>
-        <w:rPr>
-          <w:rFonts w:ascii="Calibri" w:eastAsia="Calibri" w:hAnsi="Calibri" w:cs="Calibri"/>
-          <w:lang w:val="en-US"/>
-        </w:rPr>
-        <w:t>Step 4: We associate the missing value with our key column identified is_canceled to find any association.</w:t>
-      </w:r>
-    </w:p>
-    <w:p>
-      <w:pPr>
-        <w:spacing w:line="240" w:lineRule="auto"/>
-        <w:cnfStyle w:val="001000100000" w:firstRow="0" w:lastRow="0" w:firstColumn="1" w:lastColumn="0" w:oddVBand="0" w:evenVBand="0" w:oddHBand="1" w:evenHBand="0" w:firstRowFirstColumn="0" w:firstRowLastColumn="0" w:lastRowFirstColumn="0" w:lastRowLastColumn="0"/>
-        <w:rPr>
-          <w:rFonts w:ascii="Calibri" w:eastAsia="Calibri" w:hAnsi="Calibri" w:cs="Calibri"/>
-          <w:lang w:val="en-US"/>
-        </w:rPr>
-      </w:pPr>
-      <w:r>
-        <w:rPr>
-          <w:rFonts w:ascii="Calibri" w:eastAsia="Calibri" w:hAnsi="Calibri" w:cs="Calibri"/>
-          <w:lang w:val="en-US"/>
-        </w:rPr>
-        <w:t xml:space="preserve">Step 5: We understand the data and replace the NaN values with a </w:t>
-      </w:r>
-      <w:r>
-        <w:rPr>
-          <w:rFonts w:ascii="Calibri" w:eastAsia="Calibri" w:hAnsi="Calibri" w:cs="Calibri"/>
-          <w:lang w:val="en-US"/>
-        </w:rPr>
-        <w:t>suitable value</w:t>
-      </w:r>
-      <w:r>
-        <w:rPr>
-          <w:rFonts w:ascii="Calibri" w:eastAsia="Calibri" w:hAnsi="Calibri" w:cs="Calibri"/>
-          <w:lang w:val="en-US"/>
-        </w:rPr>
-        <w:t xml:space="preserve">.             </w:t>
-      </w:r>
-      <w:r>
-        <w:rPr>
-          <w:rFonts w:ascii="Calibri" w:eastAsia="Calibri" w:hAnsi="Calibri" w:cs="Calibri"/>
-          <w:lang w:val="en-US"/>
-        </w:rPr>
-        <w:t xml:space="preserve">   </w:t>
-      </w:r>
-      <w:r>
-        <w:rPr>
-          <w:rFonts w:ascii="Calibri" w:eastAsia="Calibri" w:hAnsi="Calibri" w:cs="Calibri"/>
-          <w:lang w:val="en-US"/>
-        </w:rPr>
-        <w:t xml:space="preserve">For Example: Children </w:t>
-      </w:r>
-      <w:r>
-        <w:rPr>
-          <w:rFonts w:ascii="Calibri" w:eastAsia="Calibri" w:hAnsi="Calibri" w:cs="Calibri"/>
-          <w:lang w:val="en-US"/>
-        </w:rPr>
-        <w:t xml:space="preserve">were filled with 0 and meal was filled with Undefined. After this we check if our replacement has worked and </w:t>
-      </w:r>
-      <w:r>
-        <w:rPr>
-          <w:rFonts w:ascii="Calibri" w:eastAsia="Calibri" w:hAnsi="Calibri" w:cs="Calibri"/>
-          <w:lang w:val="en-US"/>
-        </w:rPr>
-        <w:t>there are no missing values left. Agent column had very key values with no specific pointer towards the meaning therefore we left it as it in</w:t>
-      </w:r>
-    </w:p>
-    <w:p>
-      <w:pPr>
-        <w:spacing w:line="240" w:lineRule="auto"/>
+      </w:pPr>
+      <w:r>
         <w:rPr>
           <w:rFonts w:ascii="Calibri" w:eastAsia="Calibri" w:hAnsi="Calibri" w:cs="Calibri"/>
           <w:b/>
           <w:bCs/>
           <w:lang w:val="en-US"/>
         </w:rPr>
-      </w:pPr>
-      <w:r>
+        <w:t>Duplicate Values</w:t>
+      </w:r>
+    </w:p>
+    <w:p>
+      <w:pPr>
+        <w:spacing w:line="240" w:lineRule="auto"/>
+        <w:rPr>
+          <w:rFonts w:ascii="Calibri" w:eastAsia="Calibri" w:hAnsi="Calibri" w:cs="Calibri"/>
+          <w:lang w:val="en-US"/>
+        </w:rPr>
+      </w:pPr>
+      <w:r>
+        <w:rPr>
+          <w:rFonts w:ascii="Calibri" w:eastAsia="Calibri" w:hAnsi="Calibri" w:cs="Calibri"/>
+          <w:lang w:val="en-US"/>
+        </w:rPr>
+        <w:t xml:space="preserve">Step 1: </w:t>
+      </w:r>
+      <w:proofErr w:type="gramStart"/>
+      <w:r>
+        <w:rPr>
+          <w:rFonts w:ascii="Calibri" w:eastAsia="Calibri" w:hAnsi="Calibri" w:cs="Calibri"/>
+          <w:lang w:val="en-US"/>
+        </w:rPr>
+        <w:t>First</w:t>
+      </w:r>
+      <w:proofErr w:type="gramEnd"/>
+      <w:r>
+        <w:rPr>
+          <w:rFonts w:ascii="Calibri" w:eastAsia="Calibri" w:hAnsi="Calibri" w:cs="Calibri"/>
+          <w:lang w:val="en-US"/>
+        </w:rPr>
+        <w:t xml:space="preserve"> we started with checking the content of these values </w:t>
+      </w:r>
+      <w:proofErr w:type="gramStart"/>
+      <w:r>
+        <w:rPr>
+          <w:rFonts w:ascii="Calibri" w:eastAsia="Calibri" w:hAnsi="Calibri" w:cs="Calibri"/>
+          <w:lang w:val="en-US"/>
+        </w:rPr>
+        <w:t>to  ensure</w:t>
+      </w:r>
+      <w:proofErr w:type="gramEnd"/>
+      <w:r>
+        <w:rPr>
+          <w:rFonts w:ascii="Calibri" w:eastAsia="Calibri" w:hAnsi="Calibri" w:cs="Calibri"/>
+          <w:lang w:val="en-US"/>
+        </w:rPr>
+        <w:t xml:space="preserve"> we are not dealing with any important information that can lost.</w:t>
+      </w:r>
+      <w:r>
+        <w:rPr>
+          <w:rFonts w:ascii="Calibri" w:eastAsia="Calibri" w:hAnsi="Calibri" w:cs="Calibri"/>
+          <w:lang w:val="en-US"/>
+        </w:rPr>
+        <w:t xml:space="preserve"> We also checking with is_canceled to </w:t>
+      </w:r>
+      <w:r>
+        <w:rPr>
+          <w:rFonts w:ascii="Calibri" w:eastAsia="Calibri" w:hAnsi="Calibri" w:cs="Calibri"/>
+          <w:lang w:val="en-US"/>
+        </w:rPr>
+        <w:t>derive the importance of each row to our key column.</w:t>
+      </w:r>
+    </w:p>
+    <w:p>
+      <w:pPr>
+        <w:spacing w:line="240" w:lineRule="auto"/>
+        <w:rPr>
+          <w:rFonts w:ascii="Calibri" w:eastAsia="Calibri" w:hAnsi="Calibri" w:cs="Calibri"/>
+          <w:lang w:val="en-US"/>
+        </w:rPr>
+      </w:pPr>
+      <w:r>
+        <w:rPr>
+          <w:rFonts w:ascii="Calibri" w:eastAsia="Calibri" w:hAnsi="Calibri" w:cs="Calibri"/>
+          <w:lang w:val="en-US"/>
+        </w:rPr>
+        <w:t>Step 2: We came to a conclusion to drop all these duplicate rows and we were left with 88</w:t>
+      </w:r>
+      <w:r>
+        <w:rPr>
+          <w:rFonts w:ascii="Calibri" w:eastAsia="Calibri" w:hAnsi="Calibri" w:cs="Calibri"/>
+          <w:lang w:val="en-US"/>
+        </w:rPr>
+        <w:t>603 rows after that.</w:t>
+      </w:r>
+    </w:p>
+    <w:p>
+      <w:pPr>
+        <w:spacing w:line="240" w:lineRule="auto"/>
         <w:rPr>
           <w:rFonts w:ascii="Calibri" w:eastAsia="Calibri" w:hAnsi="Calibri" w:cs="Calibri"/>
           <w:b/>
           <w:bCs/>
           <w:lang w:val="en-US"/>
         </w:rPr>
-        <w:t>Duplicate Values</w:t>
-      </w:r>
-    </w:p>
-    <w:p>
-      <w:pPr>
-        <w:spacing w:line="240" w:lineRule="auto"/>
-        <w:rPr>
-          <w:rFonts w:ascii="Calibri" w:eastAsia="Calibri" w:hAnsi="Calibri" w:cs="Calibri"/>
-          <w:lang w:val="en-US"/>
-        </w:rPr>
-      </w:pPr>
-      <w:r>
-        <w:rPr>
-          <w:rFonts w:ascii="Calibri" w:eastAsia="Calibri" w:hAnsi="Calibri" w:cs="Calibri"/>
-          <w:lang w:val="en-US"/>
-        </w:rPr>
-        <w:t xml:space="preserve">Step 1: </w:t>
-      </w:r>
-      <w:proofErr w:type="gramStart"/>
-      <w:r>
-        <w:rPr>
-          <w:rFonts w:ascii="Calibri" w:eastAsia="Calibri" w:hAnsi="Calibri" w:cs="Calibri"/>
-          <w:lang w:val="en-US"/>
-        </w:rPr>
-        <w:t>First</w:t>
-      </w:r>
-      <w:proofErr w:type="gramEnd"/>
-      <w:r>
-        <w:rPr>
-          <w:rFonts w:ascii="Calibri" w:eastAsia="Calibri" w:hAnsi="Calibri" w:cs="Calibri"/>
-          <w:lang w:val="en-US"/>
-        </w:rPr>
-        <w:t xml:space="preserve"> we started with checking the content of these values </w:t>
-      </w:r>
-      <w:proofErr w:type="gramStart"/>
-      <w:r>
-        <w:rPr>
-          <w:rFonts w:ascii="Calibri" w:eastAsia="Calibri" w:hAnsi="Calibri" w:cs="Calibri"/>
-          <w:lang w:val="en-US"/>
-        </w:rPr>
-        <w:t>to  ensure</w:t>
-      </w:r>
-      <w:proofErr w:type="gramEnd"/>
-      <w:r>
-        <w:rPr>
-          <w:rFonts w:ascii="Calibri" w:eastAsia="Calibri" w:hAnsi="Calibri" w:cs="Calibri"/>
-          <w:lang w:val="en-US"/>
-        </w:rPr>
-        <w:t xml:space="preserve"> we are not dealing with any important information that can lost.</w:t>
-      </w:r>
-      <w:r>
-        <w:rPr>
-          <w:rFonts w:ascii="Calibri" w:eastAsia="Calibri" w:hAnsi="Calibri" w:cs="Calibri"/>
-          <w:lang w:val="en-US"/>
-        </w:rPr>
-        <w:t xml:space="preserve"> We also checking with is_canceled to </w:t>
-      </w:r>
-      <w:r>
-        <w:rPr>
-          <w:rFonts w:ascii="Calibri" w:eastAsia="Calibri" w:hAnsi="Calibri" w:cs="Calibri"/>
-          <w:lang w:val="en-US"/>
-        </w:rPr>
-        <w:t>derive the importance of each row to our key column.</w:t>
-      </w:r>
-    </w:p>
-    <w:p>
-      <w:pPr>
-        <w:spacing w:line="240" w:lineRule="auto"/>
-        <w:rPr>
-          <w:rFonts w:ascii="Calibri" w:eastAsia="Calibri" w:hAnsi="Calibri" w:cs="Calibri"/>
-          <w:lang w:val="en-US"/>
-        </w:rPr>
-      </w:pPr>
-      <w:r>
-        <w:rPr>
-          <w:rFonts w:ascii="Calibri" w:eastAsia="Calibri" w:hAnsi="Calibri" w:cs="Calibri"/>
-          <w:lang w:val="en-US"/>
-        </w:rPr>
-        <w:t>Step 2: We came to a conclusion to drop all these duplicate rows and we were left with 88</w:t>
-      </w:r>
-      <w:r>
-        <w:rPr>
-          <w:rFonts w:ascii="Calibri" w:eastAsia="Calibri" w:hAnsi="Calibri" w:cs="Calibri"/>
-          <w:lang w:val="en-US"/>
-        </w:rPr>
-        <w:t>603 rows after that.</w:t>
-      </w:r>
-    </w:p>
-    <w:p>
-      <w:pPr>
-        <w:spacing w:line="240" w:lineRule="auto"/>
+      </w:pPr>
+      <w:r>
         <w:rPr>
           <w:rFonts w:ascii="Calibri" w:eastAsia="Calibri" w:hAnsi="Calibri" w:cs="Calibri"/>
           <w:b/>
           <w:bCs/>
           <w:lang w:val="en-US"/>
         </w:rPr>
-      </w:pPr>
-      <w:r>
+        <w:t>Outliers</w:t>
+      </w:r>
+    </w:p>
+    <w:p>
+      <w:pPr>
+        <w:spacing w:line="240" w:lineRule="auto"/>
+        <w:rPr>
+          <w:rFonts w:ascii="Calibri" w:eastAsia="Calibri" w:hAnsi="Calibri" w:cs="Calibri"/>
+          <w:lang w:val="en-US"/>
+        </w:rPr>
+      </w:pPr>
+      <w:r>
+        <w:rPr>
+          <w:rFonts w:ascii="Calibri" w:eastAsia="Calibri" w:hAnsi="Calibri" w:cs="Calibri"/>
+          <w:lang w:val="en-US"/>
+        </w:rPr>
+        <w:lastRenderedPageBreak/>
+        <w:t xml:space="preserve">Step 1: We grouped the values of each column to </w:t>
+      </w:r>
+      <w:r>
+        <w:rPr>
+          <w:rFonts w:ascii="Calibri" w:eastAsia="Calibri" w:hAnsi="Calibri" w:cs="Calibri"/>
+          <w:lang w:val="en-US"/>
+        </w:rPr>
+        <w:t xml:space="preserve">check for any variable that seem incorrect or impossible. For </w:t>
+      </w:r>
+      <w:r>
+        <w:rPr>
+          <w:rFonts w:ascii="Calibri" w:eastAsia="Calibri" w:hAnsi="Calibri" w:cs="Calibri"/>
+          <w:lang w:val="en-US"/>
+        </w:rPr>
+        <w:t>examples:</w:t>
+      </w:r>
+      <w:r>
+        <w:rPr>
+          <w:rFonts w:ascii="Calibri" w:eastAsia="Calibri" w:hAnsi="Calibri" w:cs="Calibri"/>
+          <w:lang w:val="en-US"/>
+        </w:rPr>
+        <w:t xml:space="preserve"> room having 50, 55, 40 adults seemed impossible.</w:t>
+      </w:r>
+      <w:r>
+        <w:rPr>
+          <w:rFonts w:ascii="Calibri" w:eastAsia="Calibri" w:hAnsi="Calibri" w:cs="Calibri"/>
+          <w:lang w:val="en-US"/>
+        </w:rPr>
+        <w:t xml:space="preserve"> </w:t>
+      </w:r>
+      <w:r>
+        <w:rPr>
+          <w:rFonts w:ascii="Calibri" w:eastAsia="Calibri" w:hAnsi="Calibri" w:cs="Calibri"/>
+          <w:lang w:val="en-US"/>
+        </w:rPr>
+        <w:t>Also,</w:t>
+      </w:r>
+      <w:r>
+        <w:rPr>
+          <w:rFonts w:ascii="Calibri" w:eastAsia="Calibri" w:hAnsi="Calibri" w:cs="Calibri"/>
+          <w:lang w:val="en-US"/>
+        </w:rPr>
+        <w:t xml:space="preserve"> we checked for negative values.</w:t>
+      </w:r>
+    </w:p>
+    <w:p>
+      <w:pPr>
+        <w:spacing w:line="240" w:lineRule="auto"/>
+        <w:rPr>
+          <w:rFonts w:ascii="Calibri" w:eastAsia="Calibri" w:hAnsi="Calibri" w:cs="Calibri"/>
+          <w:lang w:val="en-US"/>
+        </w:rPr>
+      </w:pPr>
+      <w:r>
+        <w:rPr>
+          <w:rFonts w:ascii="Calibri" w:eastAsia="Calibri" w:hAnsi="Calibri" w:cs="Calibri"/>
+          <w:lang w:val="en-US"/>
+        </w:rPr>
+        <w:t>Step 2:</w:t>
+      </w:r>
+      <w:r>
+        <w:rPr>
+          <w:rFonts w:ascii="Calibri" w:eastAsia="Calibri" w:hAnsi="Calibri" w:cs="Calibri"/>
+          <w:lang w:val="en-US"/>
+        </w:rPr>
+        <w:t xml:space="preserve"> We cleaning the negative values, Impossible values like children </w:t>
+      </w:r>
+      <w:r>
+        <w:rPr>
+          <w:rFonts w:ascii="Calibri" w:eastAsia="Calibri" w:hAnsi="Calibri" w:cs="Calibri"/>
+          <w:lang w:val="en-US"/>
+        </w:rPr>
+        <w:t>were 9, 10.</w:t>
+      </w:r>
+    </w:p>
+    <w:p>
+      <w:pPr>
+        <w:spacing w:line="240" w:lineRule="auto"/>
         <w:rPr>
           <w:rFonts w:ascii="Calibri" w:eastAsia="Calibri" w:hAnsi="Calibri" w:cs="Calibri"/>
           <w:b/>
           <w:bCs/>
           <w:lang w:val="en-US"/>
         </w:rPr>
-        <w:t>Outliers</w:t>
-      </w:r>
-    </w:p>
-    <w:p>
-      <w:pPr>
-        <w:spacing w:line="240" w:lineRule="auto"/>
-        <w:rPr>
-          <w:rFonts w:ascii="Calibri" w:eastAsia="Calibri" w:hAnsi="Calibri" w:cs="Calibri"/>
-          <w:lang w:val="en-US"/>
-        </w:rPr>
-      </w:pPr>
-      <w:r>
-        <w:rPr>
-          <w:rFonts w:ascii="Calibri" w:eastAsia="Calibri" w:hAnsi="Calibri" w:cs="Calibri"/>
-          <w:lang w:val="en-US"/>
-        </w:rPr>
-        <w:t xml:space="preserve">Step 1: We grouped the values of each column to </w:t>
-      </w:r>
-      <w:r>
-        <w:rPr>
-          <w:rFonts w:ascii="Calibri" w:eastAsia="Calibri" w:hAnsi="Calibri" w:cs="Calibri"/>
-          <w:lang w:val="en-US"/>
-        </w:rPr>
-        <w:t xml:space="preserve">check for any variable that seem incorrect or impossible. For </w:t>
-      </w:r>
-      <w:r>
-        <w:rPr>
-          <w:rFonts w:ascii="Calibri" w:eastAsia="Calibri" w:hAnsi="Calibri" w:cs="Calibri"/>
-          <w:lang w:val="en-US"/>
-        </w:rPr>
-        <w:t>examples:</w:t>
-      </w:r>
-      <w:r>
-        <w:rPr>
-          <w:rFonts w:ascii="Calibri" w:eastAsia="Calibri" w:hAnsi="Calibri" w:cs="Calibri"/>
-          <w:lang w:val="en-US"/>
-        </w:rPr>
-        <w:t xml:space="preserve"> room having 50, 55, 40 adults seemed impossible.</w:t>
-      </w:r>
-      <w:r>
-        <w:rPr>
-          <w:rFonts w:ascii="Calibri" w:eastAsia="Calibri" w:hAnsi="Calibri" w:cs="Calibri"/>
-          <w:lang w:val="en-US"/>
-        </w:rPr>
-        <w:t xml:space="preserve"> </w:t>
-      </w:r>
-      <w:r>
-        <w:rPr>
-          <w:rFonts w:ascii="Calibri" w:eastAsia="Calibri" w:hAnsi="Calibri" w:cs="Calibri"/>
-          <w:lang w:val="en-US"/>
-        </w:rPr>
-        <w:t>Also,</w:t>
-      </w:r>
-      <w:r>
-        <w:rPr>
-          <w:rFonts w:ascii="Calibri" w:eastAsia="Calibri" w:hAnsi="Calibri" w:cs="Calibri"/>
-          <w:lang w:val="en-US"/>
-        </w:rPr>
-        <w:t xml:space="preserve"> we checked for negative values.</w:t>
-      </w:r>
-    </w:p>
-    <w:p>
-      <w:pPr>
-        <w:spacing w:line="240" w:lineRule="auto"/>
-        <w:rPr>
-          <w:rFonts w:ascii="Calibri" w:eastAsia="Calibri" w:hAnsi="Calibri" w:cs="Calibri"/>
-          <w:lang w:val="en-US"/>
-        </w:rPr>
-      </w:pPr>
-      <w:r>
-        <w:rPr>
-          <w:rFonts w:ascii="Calibri" w:eastAsia="Calibri" w:hAnsi="Calibri" w:cs="Calibri"/>
-          <w:lang w:val="en-US"/>
-        </w:rPr>
-        <w:t>Step 2:</w:t>
-      </w:r>
-      <w:r>
-        <w:rPr>
-          <w:rFonts w:ascii="Calibri" w:eastAsia="Calibri" w:hAnsi="Calibri" w:cs="Calibri"/>
-          <w:lang w:val="en-US"/>
-        </w:rPr>
-        <w:t xml:space="preserve"> We cleaning the negative values, Impossible values like children </w:t>
-      </w:r>
-      <w:r>
-        <w:rPr>
-          <w:rFonts w:ascii="Calibri" w:eastAsia="Calibri" w:hAnsi="Calibri" w:cs="Calibri"/>
-          <w:lang w:val="en-US"/>
-        </w:rPr>
-        <w:t>were 9, 10.</w:t>
-      </w:r>
-    </w:p>
-    <w:p>
-      <w:pPr>
-        <w:spacing w:line="240" w:lineRule="auto"/>
+      </w:pPr>
+      <w:r>
         <w:rPr>
           <w:rFonts w:ascii="Calibri" w:eastAsia="Calibri" w:hAnsi="Calibri" w:cs="Calibri"/>
           <w:b/>
           <w:bCs/>
           <w:lang w:val="en-US"/>
         </w:rPr>
-      </w:pPr>
+        <w:t>Categorical Inconsis</w:t>
+      </w:r>
       <w:r>
         <w:rPr>
           <w:rFonts w:ascii="Calibri" w:eastAsia="Calibri" w:hAnsi="Calibri" w:cs="Calibri"/>
@@ -2662,15 +2756,6 @@
           <w:bCs/>
           <w:lang w:val="en-US"/>
         </w:rPr>
-        <w:t>Categorical Inconsis</w:t>
-      </w:r>
-      <w:r>
-        <w:rPr>
-          <w:rFonts w:ascii="Calibri" w:eastAsia="Calibri" w:hAnsi="Calibri" w:cs="Calibri"/>
-          <w:b/>
-          <w:bCs/>
-          <w:lang w:val="en-US"/>
-        </w:rPr>
         <w:t>tency</w:t>
       </w:r>
     </w:p>
@@ -2752,7 +2837,6 @@
         <w:rPr>
           <w:rFonts w:ascii="Calibri" w:eastAsia="Calibri" w:hAnsi="Calibri" w:cs="Calibri"/>
         </w:rPr>
-        <w:lastRenderedPageBreak/>
         <w:t xml:space="preserve">Step 2: After </w:t>
       </w:r>
       <w:r>
@@ -2938,6 +3022,609 @@
     </w:p>
     <w:p>
       <w:pPr>
+        <w:keepNext/>
+        <w:spacing w:before="200" w:after="120" w:line="240" w:lineRule="auto"/>
+        <w:jc w:val="center"/>
+      </w:pPr>
+      <w:r>
+        <w:rPr>
+          <w:b/>
+          <w:color w:val="000000"/>
+          <w:sz w:val="30"/>
+        </w:rPr>
+        <w:t>4. Exploratory Data Analysis EDA</w:t>
+      </w:r>
+    </w:p>
+    <w:p>
+      <w:pPr>
+        <w:pStyle w:val="Heading2"/>
+        <w:spacing w:after="60" w:line="240" w:lineRule="auto"/>
+      </w:pPr>
+      <w:r>
+        <w:rPr>
+          <w:color w:val="000000"/>
+          <w:sz w:val="26"/>
+        </w:rPr>
+        <w:t>4.1 Analysis focus and preparation</w:t>
+      </w:r>
+    </w:p>
+    <w:p>
+      <w:r>
+        <w:t xml:space="preserve">The EDA examines which pre-arrival characteristics identify higher cancellation risk. It reports cancellation rates rather than counts and considers group sizes. Minor label variations such as </w:t>
+      </w:r>
+      <w:proofErr w:type="spellStart"/>
+      <w:r>
+        <w:rPr>
+          <w:rFonts w:ascii="Consolas" w:hAnsi="Consolas"/>
+          <w:sz w:val="19"/>
+        </w:rPr>
+        <w:t>CityHotel</w:t>
+      </w:r>
+      <w:proofErr w:type="spellEnd"/>
+      <w:r>
+        <w:t xml:space="preserve"> and </w:t>
+      </w:r>
+      <w:r>
+        <w:rPr>
+          <w:rFonts w:ascii="Consolas" w:hAnsi="Consolas"/>
+          <w:sz w:val="19"/>
+        </w:rPr>
+        <w:t>City Hotel</w:t>
+      </w:r>
+      <w:r>
+        <w:t xml:space="preserve"> are standardised for display. The 31,328 exact duplicate rows are not automatically deleted because no booking identifier exists; they may represent separate bookings, and removal would change the cancellation rate from about 37.0% to 27.9%. This issue should be confirmed with the data owner before modelling.</w:t>
+      </w:r>
+    </w:p>
+    <w:p>
+      <w:pPr>
+        <w:pStyle w:val="Heading2"/>
+        <w:spacing w:after="60" w:line="240" w:lineRule="auto"/>
+      </w:pPr>
+      <w:r>
+        <w:rPr>
+          <w:color w:val="000000"/>
+          <w:sz w:val="26"/>
+        </w:rPr>
+        <w:t>4.2 Lead time</w:t>
+      </w:r>
+    </w:p>
+    <w:p>
+      <w:r>
+        <w:rPr>
+          <w:b/>
+        </w:rPr>
+        <w:t>Purpose.</w:t>
+      </w:r>
+      <w:r>
+        <w:t xml:space="preserve"> Test whether bookings made further ahead require earlier confirmation or monitoring.</w:t>
+      </w:r>
+    </w:p>
+    <w:p>
+      <w:pPr>
+        <w:keepNext/>
+        <w:spacing w:before="40" w:after="40"/>
+        <w:jc w:val="center"/>
+      </w:pPr>
+      <w:r>
+        <w:rPr>
+          <w:noProof/>
+        </w:rPr>
+        <w:lastRenderedPageBreak/>
+        <w:drawing>
+          <wp:inline distT="0" distB="0" distL="0" distR="0" wp14:anchorId="31B85844" wp14:editId="081EFD73">
+            <wp:extent cx="4754880" cy="2605946"/>
+            <wp:effectExtent l="0" t="0" r="0" b="0"/>
+            <wp:docPr id="2122502650" name="Picture 2122502650"/>
+            <wp:cNvGraphicFramePr>
+              <a:graphicFrameLocks xmlns:a="http://schemas.openxmlformats.org/drawingml/2006/main" noChangeAspect="1"/>
+            </wp:cNvGraphicFramePr>
+            <a:graphic xmlns:a="http://schemas.openxmlformats.org/drawingml/2006/main">
+              <a:graphicData uri="http://schemas.openxmlformats.org/drawingml/2006/picture">
+                <pic:pic xmlns:pic="http://schemas.openxmlformats.org/drawingml/2006/picture">
+                  <pic:nvPicPr>
+                    <pic:cNvPr id="0" name="lead_time.png"/>
+                    <pic:cNvPicPr/>
+                  </pic:nvPicPr>
+                  <pic:blipFill>
+                    <a:blip r:embed="rId9"/>
+                    <a:stretch>
+                      <a:fillRect/>
+                    </a:stretch>
+                  </pic:blipFill>
+                  <pic:spPr>
+                    <a:xfrm>
+                      <a:off x="0" y="0"/>
+                      <a:ext cx="4754880" cy="2605946"/>
+                    </a:xfrm>
+                    <a:prstGeom prst="rect">
+                      <a:avLst/>
+                    </a:prstGeom>
+                  </pic:spPr>
+                </pic:pic>
+              </a:graphicData>
+            </a:graphic>
+          </wp:inline>
+        </w:drawing>
+      </w:r>
+    </w:p>
+    <w:p>
+      <w:pPr>
+        <w:keepNext/>
+        <w:spacing w:after="80"/>
+        <w:jc w:val="center"/>
+      </w:pPr>
+      <w:r>
+        <w:rPr>
+          <w:i/>
+          <w:sz w:val="18"/>
+        </w:rPr>
+        <w:t>Figure 1. Cancellation rate by lead-time band</w:t>
+      </w:r>
+    </w:p>
+    <w:p>
+      <w:r>
+        <w:rPr>
+          <w:b/>
+        </w:rPr>
+        <w:t>Interpretation.</w:t>
+      </w:r>
+      <w:r>
+        <w:t xml:space="preserve"> Cancellation rises steadily from </w:t>
+      </w:r>
+      <w:r>
+        <w:rPr>
+          <w:b/>
+        </w:rPr>
+        <w:t>9.7% at 0–7 days</w:t>
+      </w:r>
+      <w:r>
+        <w:t xml:space="preserve"> to </w:t>
+      </w:r>
+      <w:r>
+        <w:rPr>
+          <w:b/>
+        </w:rPr>
+        <w:t>64.4% at 366+ days</w:t>
+      </w:r>
+      <w:r>
+        <w:t>. Long-lead bookings are therefore suitable for staged reconfirmation, although lead time may also reflect segment, deposit policy or season and should not be interpreted causally.</w:t>
+      </w:r>
+    </w:p>
+    <w:p>
+      <w:pPr>
+        <w:pStyle w:val="Heading2"/>
+        <w:spacing w:after="60" w:line="240" w:lineRule="auto"/>
+      </w:pPr>
+      <w:r>
+        <w:rPr>
+          <w:color w:val="000000"/>
+          <w:sz w:val="26"/>
+        </w:rPr>
+        <w:t>4.3 Market segment</w:t>
+      </w:r>
+    </w:p>
+    <w:p>
+      <w:r>
+        <w:rPr>
+          <w:b/>
+        </w:rPr>
+        <w:t>Purpose.</w:t>
+      </w:r>
+      <w:r>
+        <w:t xml:space="preserve"> Identify customer groups where targeted policies could have material value; segments with fewer than 100 bookings are excluded.</w:t>
+      </w:r>
+    </w:p>
+    <w:p>
+      <w:pPr>
+        <w:keepNext/>
+        <w:spacing w:before="40" w:after="40"/>
+        <w:jc w:val="center"/>
+      </w:pPr>
+      <w:r>
+        <w:rPr>
+          <w:noProof/>
+        </w:rPr>
+        <w:drawing>
+          <wp:inline distT="0" distB="0" distL="0" distR="0" wp14:anchorId="27EDE8F7" wp14:editId="6D0F0A71">
+            <wp:extent cx="4754880" cy="2600628"/>
+            <wp:effectExtent l="0" t="0" r="0" b="0"/>
+            <wp:docPr id="2122502651" name="Picture 2122502651"/>
+            <wp:cNvGraphicFramePr>
+              <a:graphicFrameLocks xmlns:a="http://schemas.openxmlformats.org/drawingml/2006/main" noChangeAspect="1"/>
+            </wp:cNvGraphicFramePr>
+            <a:graphic xmlns:a="http://schemas.openxmlformats.org/drawingml/2006/main">
+              <a:graphicData uri="http://schemas.openxmlformats.org/drawingml/2006/picture">
+                <pic:pic xmlns:pic="http://schemas.openxmlformats.org/drawingml/2006/picture">
+                  <pic:nvPicPr>
+                    <pic:cNvPr id="0" name="market_segment.png"/>
+                    <pic:cNvPicPr/>
+                  </pic:nvPicPr>
+                  <pic:blipFill>
+                    <a:blip r:embed="rId10"/>
+                    <a:stretch>
+                      <a:fillRect/>
+                    </a:stretch>
+                  </pic:blipFill>
+                  <pic:spPr>
+                    <a:xfrm>
+                      <a:off x="0" y="0"/>
+                      <a:ext cx="4754880" cy="2600628"/>
+                    </a:xfrm>
+                    <a:prstGeom prst="rect">
+                      <a:avLst/>
+                    </a:prstGeom>
+                  </pic:spPr>
+                </pic:pic>
+              </a:graphicData>
+            </a:graphic>
+          </wp:inline>
+        </w:drawing>
+      </w:r>
+    </w:p>
+    <w:p>
+      <w:pPr>
+        <w:keepNext/>
+        <w:spacing w:after="80"/>
+        <w:jc w:val="center"/>
+      </w:pPr>
+      <w:r>
+        <w:rPr>
+          <w:i/>
+          <w:sz w:val="18"/>
+        </w:rPr>
+        <w:t>Figure 2. Cancellation rate by market segment</w:t>
+      </w:r>
+    </w:p>
+    <w:p>
+      <w:r>
+        <w:rPr>
+          <w:b/>
+        </w:rPr>
+        <w:t>Interpretation.</w:t>
+      </w:r>
+      <w:r>
+        <w:t xml:space="preserve"> The </w:t>
+      </w:r>
+      <w:r>
+        <w:rPr>
+          <w:b/>
+        </w:rPr>
+        <w:t>Groups</w:t>
+      </w:r>
+      <w:r>
+        <w:t xml:space="preserve"> segment cancels at </w:t>
+      </w:r>
+      <w:r>
+        <w:rPr>
+          <w:b/>
+        </w:rPr>
+        <w:t>61.0%</w:t>
+      </w:r>
+      <w:r>
+        <w:t xml:space="preserve">, compared with </w:t>
+      </w:r>
+      <w:r>
+        <w:rPr>
+          <w:b/>
+        </w:rPr>
+        <w:t>15.4% for Direct</w:t>
+      </w:r>
+      <w:r>
+        <w:t xml:space="preserve"> and </w:t>
+      </w:r>
+      <w:r>
+        <w:rPr>
+          <w:b/>
+        </w:rPr>
+        <w:t>18.7% for Corporate</w:t>
+      </w:r>
+      <w:r>
+        <w:t>, and contains 19,895 bookings. The hotel could review group release dates, deposits and reconfirmation, but Assignment 2 should test whether the effect remains after accounting for lead time and channel.</w:t>
+      </w:r>
+    </w:p>
+    <w:p>
+      <w:pPr>
+        <w:pStyle w:val="Heading2"/>
+        <w:spacing w:after="60" w:line="240" w:lineRule="auto"/>
+      </w:pPr>
+      <w:r>
+        <w:rPr>
+          <w:color w:val="000000"/>
+          <w:sz w:val="26"/>
+        </w:rPr>
+        <w:lastRenderedPageBreak/>
+        <w:t>4.4 Special requests</w:t>
+      </w:r>
+    </w:p>
+    <w:p>
+      <w:r>
+        <w:rPr>
+          <w:b/>
+        </w:rPr>
+        <w:t>Purpose.</w:t>
+      </w:r>
+      <w:r>
+        <w:t xml:space="preserve"> Examine whether observable booking engagement is associated with cancellation risk.</w:t>
+      </w:r>
+    </w:p>
+    <w:p>
+      <w:pPr>
+        <w:keepNext/>
+        <w:spacing w:before="40" w:after="40"/>
+        <w:jc w:val="center"/>
+      </w:pPr>
+      <w:r>
+        <w:rPr>
+          <w:noProof/>
+        </w:rPr>
+        <w:drawing>
+          <wp:inline distT="0" distB="0" distL="0" distR="0" wp14:anchorId="75109286" wp14:editId="17D21A17">
+            <wp:extent cx="4754880" cy="2605946"/>
+            <wp:effectExtent l="0" t="0" r="0" b="0"/>
+            <wp:docPr id="2122502652" name="Picture 2122502652"/>
+            <wp:cNvGraphicFramePr>
+              <a:graphicFrameLocks xmlns:a="http://schemas.openxmlformats.org/drawingml/2006/main" noChangeAspect="1"/>
+            </wp:cNvGraphicFramePr>
+            <a:graphic xmlns:a="http://schemas.openxmlformats.org/drawingml/2006/main">
+              <a:graphicData uri="http://schemas.openxmlformats.org/drawingml/2006/picture">
+                <pic:pic xmlns:pic="http://schemas.openxmlformats.org/drawingml/2006/picture">
+                  <pic:nvPicPr>
+                    <pic:cNvPr id="0" name="special_requests.png"/>
+                    <pic:cNvPicPr/>
+                  </pic:nvPicPr>
+                  <pic:blipFill>
+                    <a:blip r:embed="rId11"/>
+                    <a:stretch>
+                      <a:fillRect/>
+                    </a:stretch>
+                  </pic:blipFill>
+                  <pic:spPr>
+                    <a:xfrm>
+                      <a:off x="0" y="0"/>
+                      <a:ext cx="4754880" cy="2605946"/>
+                    </a:xfrm>
+                    <a:prstGeom prst="rect">
+                      <a:avLst/>
+                    </a:prstGeom>
+                  </pic:spPr>
+                </pic:pic>
+              </a:graphicData>
+            </a:graphic>
+          </wp:inline>
+        </w:drawing>
+      </w:r>
+    </w:p>
+    <w:p>
+      <w:pPr>
+        <w:keepNext/>
+        <w:spacing w:after="80"/>
+        <w:jc w:val="center"/>
+      </w:pPr>
+      <w:r>
+        <w:rPr>
+          <w:i/>
+          <w:sz w:val="18"/>
+        </w:rPr>
+        <w:t>Figure 3. Cancellation rate by number of special requests</w:t>
+      </w:r>
+    </w:p>
+    <w:p>
+      <w:r>
+        <w:rPr>
+          <w:b/>
+        </w:rPr>
+        <w:t>Interpretation.</w:t>
+      </w:r>
+      <w:r>
+        <w:t xml:space="preserve"> Bookings with </w:t>
+      </w:r>
+      <w:r>
+        <w:rPr>
+          <w:b/>
+        </w:rPr>
+        <w:t>no special requests cancel at 47.7%</w:t>
+      </w:r>
+      <w:r>
+        <w:t xml:space="preserve">, versus about </w:t>
+      </w:r>
+      <w:r>
+        <w:rPr>
+          <w:b/>
+        </w:rPr>
+        <w:t>22% with one or two requests</w:t>
+      </w:r>
+      <w:r>
+        <w:t>. This is a useful prioritisation signal, but the lowest rates at four or five requests use only 342 and 40 bookings. The team must also confirm that requests are recorded before scoring to avoid temporal leakage.</w:t>
+      </w:r>
+    </w:p>
+    <w:p>
+      <w:pPr>
+        <w:pStyle w:val="Heading2"/>
+        <w:spacing w:after="60" w:line="240" w:lineRule="auto"/>
+      </w:pPr>
+      <w:r>
+        <w:rPr>
+          <w:color w:val="000000"/>
+          <w:sz w:val="26"/>
+        </w:rPr>
+        <w:t>4.5 Arrival month</w:t>
+      </w:r>
+    </w:p>
+    <w:p>
+      <w:r>
+        <w:rPr>
+          <w:b/>
+        </w:rPr>
+        <w:t>Purpose.</w:t>
+      </w:r>
+      <w:r>
+        <w:t xml:space="preserve"> Test whether the cancellation base rate changes over time and affects validation and operational planning.</w:t>
+      </w:r>
+    </w:p>
+    <w:p>
+      <w:pPr>
+        <w:keepNext/>
+        <w:spacing w:before="40" w:after="40"/>
+        <w:jc w:val="center"/>
+      </w:pPr>
+      <w:r>
+        <w:rPr>
+          <w:noProof/>
+        </w:rPr>
+        <w:drawing>
+          <wp:inline distT="0" distB="0" distL="0" distR="0" wp14:anchorId="723F9E1F" wp14:editId="0DA20D31">
+            <wp:extent cx="4754880" cy="2127392"/>
+            <wp:effectExtent l="0" t="0" r="0" b="0"/>
+            <wp:docPr id="2122502653" name="Picture 2122502653"/>
+            <wp:cNvGraphicFramePr>
+              <a:graphicFrameLocks xmlns:a="http://schemas.openxmlformats.org/drawingml/2006/main" noChangeAspect="1"/>
+            </wp:cNvGraphicFramePr>
+            <a:graphic xmlns:a="http://schemas.openxmlformats.org/drawingml/2006/main">
+              <a:graphicData uri="http://schemas.openxmlformats.org/drawingml/2006/picture">
+                <pic:pic xmlns:pic="http://schemas.openxmlformats.org/drawingml/2006/picture">
+                  <pic:nvPicPr>
+                    <pic:cNvPr id="0" name="arrival_month.png"/>
+                    <pic:cNvPicPr/>
+                  </pic:nvPicPr>
+                  <pic:blipFill>
+                    <a:blip r:embed="rId12"/>
+                    <a:stretch>
+                      <a:fillRect/>
+                    </a:stretch>
+                  </pic:blipFill>
+                  <pic:spPr>
+                    <a:xfrm>
+                      <a:off x="0" y="0"/>
+                      <a:ext cx="4754880" cy="2127392"/>
+                    </a:xfrm>
+                    <a:prstGeom prst="rect">
+                      <a:avLst/>
+                    </a:prstGeom>
+                  </pic:spPr>
+                </pic:pic>
+              </a:graphicData>
+            </a:graphic>
+          </wp:inline>
+        </w:drawing>
+      </w:r>
+    </w:p>
+    <w:p>
+      <w:pPr>
+        <w:keepNext/>
+        <w:spacing w:after="80"/>
+        <w:jc w:val="center"/>
+      </w:pPr>
+      <w:r>
+        <w:rPr>
+          <w:i/>
+          <w:sz w:val="18"/>
+        </w:rPr>
+        <w:t>Figure 4. Monthly booking cancellation rate</w:t>
+      </w:r>
+    </w:p>
+    <w:p>
+      <w:r>
+        <w:rPr>
+          <w:b/>
+        </w:rPr>
+        <w:t>Interpretation.</w:t>
+      </w:r>
+      <w:r>
+        <w:t xml:space="preserve"> Monthly cancellation ranges from </w:t>
+      </w:r>
+      <w:r>
+        <w:rPr>
+          <w:b/>
+        </w:rPr>
+        <w:t>20.7% in November 2015</w:t>
+      </w:r>
+      <w:r>
+        <w:t xml:space="preserve"> to </w:t>
+      </w:r>
+      <w:r>
+        <w:rPr>
+          <w:b/>
+        </w:rPr>
+        <w:t>45.4% in July 2015</w:t>
+      </w:r>
+      <w:r>
+        <w:t xml:space="preserve">, with another rise to about </w:t>
+      </w:r>
+      <w:r>
+        <w:rPr>
+          <w:b/>
+        </w:rPr>
+        <w:t>43–44% in April–June 2017</w:t>
+      </w:r>
+      <w:r>
+        <w:t xml:space="preserve">. The manager should not </w:t>
+      </w:r>
+      <w:r>
+        <w:lastRenderedPageBreak/>
+        <w:t>assume a stable base rate. A chronological split is preferable for Assignment 2, although the July 2015–August 2017 window cannot cleanly separate seasonality from year effects.</w:t>
+      </w:r>
+    </w:p>
+    <w:p>
+      <w:pPr>
+        <w:pStyle w:val="Heading2"/>
+        <w:spacing w:after="60" w:line="240" w:lineRule="auto"/>
+      </w:pPr>
+      <w:r>
+        <w:rPr>
+          <w:color w:val="000000"/>
+          <w:sz w:val="26"/>
+        </w:rPr>
+        <w:t>4.6 Assignment 2 plan</w:t>
+      </w:r>
+    </w:p>
+    <w:p>
+      <w:r>
+        <w:t xml:space="preserve">The target remains </w:t>
+      </w:r>
+      <w:proofErr w:type="spellStart"/>
+      <w:r>
+        <w:rPr>
+          <w:rFonts w:ascii="Consolas" w:hAnsi="Consolas"/>
+          <w:sz w:val="19"/>
+        </w:rPr>
+        <w:t>is_canceled</w:t>
+      </w:r>
+      <w:proofErr w:type="spellEnd"/>
+      <w:r>
+        <w:t xml:space="preserve"> at a defined pre-arrival scoring time. Start with an interpretable regularised logistic-regression baseline and compare it with a tree-based method that can capture nonlinearities and interactions. Use time-ordered validation, probability calibration, PR-AUC or ROC-AUC for ranking, and precision, recall and estimated error costs at an operational threshold.</w:t>
+      </w:r>
+    </w:p>
+    <w:p>
+      <w:r>
+        <w:t xml:space="preserve">Candidate features should be limited to information known at scoring time. Exclude </w:t>
+      </w:r>
+      <w:proofErr w:type="spellStart"/>
+      <w:r>
+        <w:rPr>
+          <w:rFonts w:ascii="Consolas" w:hAnsi="Consolas"/>
+          <w:sz w:val="19"/>
+        </w:rPr>
+        <w:t>reservation_status</w:t>
+      </w:r>
+      <w:proofErr w:type="spellEnd"/>
+      <w:r>
+        <w:t xml:space="preserve"> and </w:t>
+      </w:r>
+      <w:proofErr w:type="spellStart"/>
+      <w:r>
+        <w:rPr>
+          <w:rFonts w:ascii="Consolas" w:hAnsi="Consolas"/>
+          <w:sz w:val="19"/>
+        </w:rPr>
+        <w:t>reservation_status_date</w:t>
+      </w:r>
+      <w:proofErr w:type="spellEnd"/>
+      <w:r>
+        <w:t>; verify the timing of assigned room, booking changes, waiting-list information and special requests; and handle high-cardinality agent or company fields carefully. Before modelling, resolve the duplicate-booking ambiguity, standardise categories, address missingness, and investigate impossible guest counts and ADR outliers. Test performance across hotels, time periods and major segments, monitor probability drift, and use predictions to support human decisions rather than blanket restrictions.</w:t>
+      </w:r>
+    </w:p>
+    <w:p>
+      <w:pPr>
         <w:spacing w:line="240" w:lineRule="auto"/>
         <w:rPr>
           <w:rFonts w:ascii="Calibri" w:eastAsia="Calibri" w:hAnsi="Calibri" w:cs="Calibri"/>
@@ -2950,7 +3637,7 @@
       </w:pPr>
     </w:p>
     <w:sectPr>
-      <w:headerReference w:type="default" r:id="rId9"/>
+      <w:headerReference w:type="default" r:id="rId13"/>
       <w:pgSz w:w="11906" w:h="16838"/>
       <w:pgMar w:top="1440" w:right="1440" w:bottom="1440" w:left="1440" w:header="142" w:footer="708" w:gutter="0"/>
       <w:cols w:space="708"/>
@@ -2961,7 +3648,7 @@
 </file>
 
 <file path=word/endnotes.xml><?xml version="1.0" encoding="utf-8"?>
-<w:endnotes xmlns:wpc="http://schemas.microsoft.com/office/word/2010/wordprocessingCanvas" xmlns:cx="http://schemas.microsoft.com/office/drawing/2014/chartex" xmlns:cx1="http://schemas.microsoft.com/office/drawing/2015/9/8/chartex" xmlns:cx2="http://schemas.microsoft.com/office/drawing/2015/10/21/chartex" xmlns:cx3="http://schemas.microsoft.com/office/drawing/2016/5/9/chartex" xmlns:cx4="http://schemas.microsoft.com/office/drawing/2016/5/10/chartex" xmlns:cx5="http://schemas.microsoft.com/office/drawing/2016/5/11/chartex" xmlns:cx6="http://schemas.microsoft.com/office/drawing/2016/5/12/chartex" xmlns:cx7="http://schemas.microsoft.com/office/drawing/2016/5/13/chartex" xmlns:cx8="http://schemas.microsoft.com/office/drawing/2016/5/14/chartex" xmlns:mc="http://schemas.openxmlformats.org/markup-compatibility/2006" xmlns:aink="http://schemas.microsoft.com/office/drawing/2016/ink" xmlns:am3d="http://schemas.microsoft.com/office/drawing/2017/model3d" xmlns:o="urn:schemas-microsoft-com:office:office" xmlns:oel="http://schemas.microsoft.com/office/2019/extlst" xmlns:r="http://schemas.openxmlformats.org/officeDocument/2006/relationships" xmlns:m="http://schemas.openxmlformats.org/officeDocument/2006/math" xmlns:v="urn:schemas-microsoft-com:vml" xmlns:wp14="http://schemas.microsoft.com/office/word/2010/wordprocessingDrawing" xmlns:wp="http://schemas.openxmlformats.org/drawingml/2006/wordprocessingDrawing" xmlns:w10="urn:schemas-microsoft-com:office:word" xmlns:w="http://schemas.openxmlformats.org/wordprocessingml/2006/main" xmlns:w14="http://schemas.microsoft.com/office/word/2010/wordml" xmlns:w15="http://schemas.microsoft.com/office/word/2012/wordml" xmlns:w16cex="http://schemas.microsoft.com/office/word/2018/wordml/cex" xmlns:w16cid="http://schemas.microsoft.com/office/word/2016/wordml/cid" xmlns:w16="http://schemas.microsoft.com/office/word/2018/wordml" xmlns:w16du="http://schemas.microsoft.com/office/word/2023/wordml/word16du" xmlns:w16sdtdh="http://schemas.microsoft.com/office/word/2020/wordml/sdtdatahash" xmlns:w16sdtfl="http://schemas.microsoft.com/office/word/2024/wordml/sdtformatlock" xmlns:w16se="http://schemas.microsoft.com/office/word/2015/wordml/symex" xmlns:wpg="http://schemas.microsoft.com/office/word/2010/wordprocessingGroup" xmlns:wpi="http://schemas.microsoft.com/office/word/2010/wordprocessingInk" xmlns:wne="http://schemas.microsoft.com/office/word/2006/wordml" xmlns:wps="http://schemas.microsoft.com/office/word/2010/wordprocessingShape" mc:Ignorable="w14 w15 w16se w16cid w16 w16cex w16sdtdh w16sdtfl w16du wp14">
+<w:endnotes xmlns:wpc="http://schemas.microsoft.com/office/word/2010/wordprocessingCanvas" xmlns:cx="http://schemas.microsoft.com/office/drawing/2014/chartex" xmlns:cx1="http://schemas.microsoft.com/office/drawing/2015/9/8/chartex" xmlns:cx2="http://schemas.microsoft.com/office/drawing/2015/10/21/chartex" xmlns:cx3="http://schemas.microsoft.com/office/drawing/2016/5/9/chartex" xmlns:cx4="http://schemas.microsoft.com/office/drawing/2016/5/10/chartex" xmlns:cx5="http://schemas.microsoft.com/office/drawing/2016/5/11/chartex" xmlns:cx6="http://schemas.microsoft.com/office/drawing/2016/5/12/chartex" xmlns:cx7="http://schemas.microsoft.com/office/drawing/2016/5/13/chartex" xmlns:cx8="http://schemas.microsoft.com/office/drawing/2016/5/14/chartex" xmlns:mc="http://schemas.openxmlformats.org/markup-compatibility/2006" xmlns:m="http://schemas.openxmlformats.org/officeDocument/2006/math" xmlns:aink="http://schemas.microsoft.com/office/drawing/2016/ink" xmlns:am3d="http://schemas.microsoft.com/office/drawing/2017/model3d" xmlns:oel="http://schemas.microsoft.com/office/2019/extlst" xmlns:r="http://schemas.openxmlformats.org/officeDocument/2006/relationships" xmlns:wp14="http://schemas.microsoft.com/office/word/2010/wordprocessingDrawing" xmlns:wp="http://schemas.openxmlformats.org/drawingml/2006/wordprocessingDrawing" xmlns:wpg="http://schemas.microsoft.com/office/word/2010/wordprocessingGroup" xmlns:wpi="http://schemas.microsoft.com/office/word/2010/wordprocessingInk" xmlns:wps="http://schemas.microsoft.com/office/word/2010/wordprocessingShape" xmlns:o="urn:schemas-microsoft-com:office:office" xmlns:v="urn:schemas-microsoft-com:vml" xmlns:w10="urn:schemas-microsoft-com:office:word" xmlns:w="http://schemas.openxmlformats.org/wordprocessingml/2006/main" xmlns:w14="http://schemas.microsoft.com/office/word/2010/wordml" xmlns:w15="http://schemas.microsoft.com/office/word/2012/wordml" xmlns:w16cex="http://schemas.microsoft.com/office/word/2018/wordml/cex" xmlns:w16cid="http://schemas.microsoft.com/office/word/2016/wordml/cid" xmlns:w16="http://schemas.microsoft.com/office/word/2018/wordml" xmlns:w16sdtdh="http://schemas.microsoft.com/office/word/2020/wordml/sdtdatahash" xmlns:w16sdtfl="http://schemas.microsoft.com/office/word/2024/wordml/sdtformatlock" xmlns:w16se="http://schemas.microsoft.com/office/word/2015/wordml/symex" xmlns:w16du="http://schemas.microsoft.com/office/word/2023/wordml/word16du" xmlns:wne="http://schemas.microsoft.com/office/word/2006/wordml" mc:Ignorable="w14 w15 w16se w16cid w16 w16cex w16sdtdh w16sdtfl w16du wp14">
   <w:endnote w:type="separator" w:id="-1">
     <w:p>
       <w:pPr>
@@ -2986,7 +3673,7 @@
 </file>
 
 <file path=word/footnotes.xml><?xml version="1.0" encoding="utf-8"?>
-<w:footnotes xmlns:wpc="http://schemas.microsoft.com/office/word/2010/wordprocessingCanvas" xmlns:cx="http://schemas.microsoft.com/office/drawing/2014/chartex" xmlns:cx1="http://schemas.microsoft.com/office/drawing/2015/9/8/chartex" xmlns:cx2="http://schemas.microsoft.com/office/drawing/2015/10/21/chartex" xmlns:cx3="http://schemas.microsoft.com/office/drawing/2016/5/9/chartex" xmlns:cx4="http://schemas.microsoft.com/office/drawing/2016/5/10/chartex" xmlns:cx5="http://schemas.microsoft.com/office/drawing/2016/5/11/chartex" xmlns:cx6="http://schemas.microsoft.com/office/drawing/2016/5/12/chartex" xmlns:cx7="http://schemas.microsoft.com/office/drawing/2016/5/13/chartex" xmlns:cx8="http://schemas.microsoft.com/office/drawing/2016/5/14/chartex" xmlns:mc="http://schemas.openxmlformats.org/markup-compatibility/2006" xmlns:aink="http://schemas.microsoft.com/office/drawing/2016/ink" xmlns:am3d="http://schemas.microsoft.com/office/drawing/2017/model3d" xmlns:o="urn:schemas-microsoft-com:office:office" xmlns:oel="http://schemas.microsoft.com/office/2019/extlst" xmlns:r="http://schemas.openxmlformats.org/officeDocument/2006/relationships" xmlns:m="http://schemas.openxmlformats.org/officeDocument/2006/math" xmlns:v="urn:schemas-microsoft-com:vml" xmlns:wp14="http://schemas.microsoft.com/office/word/2010/wordprocessingDrawing" xmlns:wp="http://schemas.openxmlformats.org/drawingml/2006/wordprocessingDrawing" xmlns:w10="urn:schemas-microsoft-com:office:word" xmlns:w="http://schemas.openxmlformats.org/wordprocessingml/2006/main" xmlns:w14="http://schemas.microsoft.com/office/word/2010/wordml" xmlns:w15="http://schemas.microsoft.com/office/word/2012/wordml" xmlns:w16cex="http://schemas.microsoft.com/office/word/2018/wordml/cex" xmlns:w16cid="http://schemas.microsoft.com/office/word/2016/wordml/cid" xmlns:w16="http://schemas.microsoft.com/office/word/2018/wordml" xmlns:w16du="http://schemas.microsoft.com/office/word/2023/wordml/word16du" xmlns:w16sdtdh="http://schemas.microsoft.com/office/word/2020/wordml/sdtdatahash" xmlns:w16sdtfl="http://schemas.microsoft.com/office/word/2024/wordml/sdtformatlock" xmlns:w16se="http://schemas.microsoft.com/office/word/2015/wordml/symex" xmlns:wpg="http://schemas.microsoft.com/office/word/2010/wordprocessingGroup" xmlns:wpi="http://schemas.microsoft.com/office/word/2010/wordprocessingInk" xmlns:wne="http://schemas.microsoft.com/office/word/2006/wordml" xmlns:wps="http://schemas.microsoft.com/office/word/2010/wordprocessingShape" mc:Ignorable="w14 w15 w16se w16cid w16 w16cex w16sdtdh w16sdtfl w16du wp14">
+<w:footnotes xmlns:wpc="http://schemas.microsoft.com/office/word/2010/wordprocessingCanvas" xmlns:cx="http://schemas.microsoft.com/office/drawing/2014/chartex" xmlns:cx1="http://schemas.microsoft.com/office/drawing/2015/9/8/chartex" xmlns:cx2="http://schemas.microsoft.com/office/drawing/2015/10/21/chartex" xmlns:cx3="http://schemas.microsoft.com/office/drawing/2016/5/9/chartex" xmlns:cx4="http://schemas.microsoft.com/office/drawing/2016/5/10/chartex" xmlns:cx5="http://schemas.microsoft.com/office/drawing/2016/5/11/chartex" xmlns:cx6="http://schemas.microsoft.com/office/drawing/2016/5/12/chartex" xmlns:cx7="http://schemas.microsoft.com/office/drawing/2016/5/13/chartex" xmlns:cx8="http://schemas.microsoft.com/office/drawing/2016/5/14/chartex" xmlns:mc="http://schemas.openxmlformats.org/markup-compatibility/2006" xmlns:m="http://schemas.openxmlformats.org/officeDocument/2006/math" xmlns:aink="http://schemas.microsoft.com/office/drawing/2016/ink" xmlns:am3d="http://schemas.microsoft.com/office/drawing/2017/model3d" xmlns:oel="http://schemas.microsoft.com/office/2019/extlst" xmlns:r="http://schemas.openxmlformats.org/officeDocument/2006/relationships" xmlns:wp14="http://schemas.microsoft.com/office/word/2010/wordprocessingDrawing" xmlns:wp="http://schemas.openxmlformats.org/drawingml/2006/wordprocessingDrawing" xmlns:wpg="http://schemas.microsoft.com/office/word/2010/wordprocessingGroup" xmlns:wpi="http://schemas.microsoft.com/office/word/2010/wordprocessingInk" xmlns:wps="http://schemas.microsoft.com/office/word/2010/wordprocessingShape" xmlns:o="urn:schemas-microsoft-com:office:office" xmlns:v="urn:schemas-microsoft-com:vml" xmlns:w10="urn:schemas-microsoft-com:office:word" xmlns:w="http://schemas.openxmlformats.org/wordprocessingml/2006/main" xmlns:w14="http://schemas.microsoft.com/office/word/2010/wordml" xmlns:w15="http://schemas.microsoft.com/office/word/2012/wordml" xmlns:w16cex="http://schemas.microsoft.com/office/word/2018/wordml/cex" xmlns:w16cid="http://schemas.microsoft.com/office/word/2016/wordml/cid" xmlns:w16="http://schemas.microsoft.com/office/word/2018/wordml" xmlns:w16sdtdh="http://schemas.microsoft.com/office/word/2020/wordml/sdtdatahash" xmlns:w16sdtfl="http://schemas.microsoft.com/office/word/2024/wordml/sdtformatlock" xmlns:w16se="http://schemas.microsoft.com/office/word/2015/wordml/symex" xmlns:w16du="http://schemas.microsoft.com/office/word/2023/wordml/word16du" xmlns:wne="http://schemas.microsoft.com/office/word/2006/wordml" mc:Ignorable="w14 w15 w16se w16cid w16 w16cex w16sdtdh w16sdtfl w16du wp14">
   <w:footnote w:type="separator" w:id="-1">
     <w:p>
       <w:pPr>
@@ -3011,7 +3698,7 @@
 </file>
 
 <file path=word/header1.xml><?xml version="1.0" encoding="utf-8"?>
-<w:hdr xmlns:wpc="http://schemas.microsoft.com/office/word/2010/wordprocessingCanvas" xmlns:cx="http://schemas.microsoft.com/office/drawing/2014/chartex" xmlns:cx1="http://schemas.microsoft.com/office/drawing/2015/9/8/chartex" xmlns:cx2="http://schemas.microsoft.com/office/drawing/2015/10/21/chartex" xmlns:cx3="http://schemas.microsoft.com/office/drawing/2016/5/9/chartex" xmlns:cx4="http://schemas.microsoft.com/office/drawing/2016/5/10/chartex" xmlns:cx5="http://schemas.microsoft.com/office/drawing/2016/5/11/chartex" xmlns:cx6="http://schemas.microsoft.com/office/drawing/2016/5/12/chartex" xmlns:cx7="http://schemas.microsoft.com/office/drawing/2016/5/13/chartex" xmlns:cx8="http://schemas.microsoft.com/office/drawing/2016/5/14/chartex" xmlns:mc="http://schemas.openxmlformats.org/markup-compatibility/2006" xmlns:aink="http://schemas.microsoft.com/office/drawing/2016/ink" xmlns:am3d="http://schemas.microsoft.com/office/drawing/2017/model3d" xmlns:o="urn:schemas-microsoft-com:office:office" xmlns:oel="http://schemas.microsoft.com/office/2019/extlst" xmlns:r="http://schemas.openxmlformats.org/officeDocument/2006/relationships" xmlns:m="http://schemas.openxmlformats.org/officeDocument/2006/math" xmlns:v="urn:schemas-microsoft-com:vml" xmlns:wp14="http://schemas.microsoft.com/office/word/2010/wordprocessingDrawing" xmlns:wp="http://schemas.openxmlformats.org/drawingml/2006/wordprocessingDrawing" xmlns:w10="urn:schemas-microsoft-com:office:word" xmlns:w="http://schemas.openxmlformats.org/wordprocessingml/2006/main" xmlns:w14="http://schemas.microsoft.com/office/word/2010/wordml" xmlns:w15="http://schemas.microsoft.com/office/word/2012/wordml" xmlns:w16cex="http://schemas.microsoft.com/office/word/2018/wordml/cex" xmlns:w16cid="http://schemas.microsoft.com/office/word/2016/wordml/cid" xmlns:w16="http://schemas.microsoft.com/office/word/2018/wordml" xmlns:w16du="http://schemas.microsoft.com/office/word/2023/wordml/word16du" xmlns:w16sdtdh="http://schemas.microsoft.com/office/word/2020/wordml/sdtdatahash" xmlns:w16sdtfl="http://schemas.microsoft.com/office/word/2024/wordml/sdtformatlock" xmlns:w16se="http://schemas.microsoft.com/office/word/2015/wordml/symex" xmlns:wpg="http://schemas.microsoft.com/office/word/2010/wordprocessingGroup" xmlns:wpi="http://schemas.microsoft.com/office/word/2010/wordprocessingInk" xmlns:wne="http://schemas.microsoft.com/office/word/2006/wordml" xmlns:wps="http://schemas.microsoft.com/office/word/2010/wordprocessingShape" mc:Ignorable="w14 w15 w16se w16cid w16 w16cex w16sdtdh w16sdtfl w16du wp14">
+<w:hdr xmlns:wpc="http://schemas.microsoft.com/office/word/2010/wordprocessingCanvas" xmlns:cx="http://schemas.microsoft.com/office/drawing/2014/chartex" xmlns:cx1="http://schemas.microsoft.com/office/drawing/2015/9/8/chartex" xmlns:cx2="http://schemas.microsoft.com/office/drawing/2015/10/21/chartex" xmlns:cx3="http://schemas.microsoft.com/office/drawing/2016/5/9/chartex" xmlns:cx4="http://schemas.microsoft.com/office/drawing/2016/5/10/chartex" xmlns:cx5="http://schemas.microsoft.com/office/drawing/2016/5/11/chartex" xmlns:cx6="http://schemas.microsoft.com/office/drawing/2016/5/12/chartex" xmlns:cx7="http://schemas.microsoft.com/office/drawing/2016/5/13/chartex" xmlns:cx8="http://schemas.microsoft.com/office/drawing/2016/5/14/chartex" xmlns:mc="http://schemas.openxmlformats.org/markup-compatibility/2006" xmlns:m="http://schemas.openxmlformats.org/officeDocument/2006/math" xmlns:aink="http://schemas.microsoft.com/office/drawing/2016/ink" xmlns:am3d="http://schemas.microsoft.com/office/drawing/2017/model3d" xmlns:oel="http://schemas.microsoft.com/office/2019/extlst" xmlns:r="http://schemas.openxmlformats.org/officeDocument/2006/relationships" xmlns:wp14="http://schemas.microsoft.com/office/word/2010/wordprocessingDrawing" xmlns:wp="http://schemas.openxmlformats.org/drawingml/2006/wordprocessingDrawing" xmlns:wpg="http://schemas.microsoft.com/office/word/2010/wordprocessingGroup" xmlns:wpi="http://schemas.microsoft.com/office/word/2010/wordprocessingInk" xmlns:wps="http://schemas.microsoft.com/office/word/2010/wordprocessingShape" xmlns:o="urn:schemas-microsoft-com:office:office" xmlns:v="urn:schemas-microsoft-com:vml" xmlns:w10="urn:schemas-microsoft-com:office:word" xmlns:w="http://schemas.openxmlformats.org/wordprocessingml/2006/main" xmlns:w14="http://schemas.microsoft.com/office/word/2010/wordml" xmlns:w15="http://schemas.microsoft.com/office/word/2012/wordml" xmlns:w16cex="http://schemas.microsoft.com/office/word/2018/wordml/cex" xmlns:w16cid="http://schemas.microsoft.com/office/word/2016/wordml/cid" xmlns:w16="http://schemas.microsoft.com/office/word/2018/wordml" xmlns:w16sdtdh="http://schemas.microsoft.com/office/word/2020/wordml/sdtdatahash" xmlns:w16sdtfl="http://schemas.microsoft.com/office/word/2024/wordml/sdtformatlock" xmlns:w16se="http://schemas.microsoft.com/office/word/2015/wordml/symex" xmlns:w16du="http://schemas.microsoft.com/office/word/2023/wordml/word16du" xmlns:wne="http://schemas.microsoft.com/office/word/2006/wordml" mc:Ignorable="w14 w15 w16se w16cid w16 w16cex w16sdtdh w16sdtfl w16du wp14">
   <w:p>
     <w:pPr>
       <w:pStyle w:val="Header"/>
@@ -3158,7 +3845,7 @@
 </file>
 
 <file path=word/numbering.xml><?xml version="1.0" encoding="utf-8"?>
-<w:numbering xmlns:wpc="http://schemas.microsoft.com/office/word/2010/wordprocessingCanvas" xmlns:cx="http://schemas.microsoft.com/office/drawing/2014/chartex" xmlns:cx1="http://schemas.microsoft.com/office/drawing/2015/9/8/chartex" xmlns:cx2="http://schemas.microsoft.com/office/drawing/2015/10/21/chartex" xmlns:cx3="http://schemas.microsoft.com/office/drawing/2016/5/9/chartex" xmlns:cx4="http://schemas.microsoft.com/office/drawing/2016/5/10/chartex" xmlns:cx5="http://schemas.microsoft.com/office/drawing/2016/5/11/chartex" xmlns:cx6="http://schemas.microsoft.com/office/drawing/2016/5/12/chartex" xmlns:cx7="http://schemas.microsoft.com/office/drawing/2016/5/13/chartex" xmlns:cx8="http://schemas.microsoft.com/office/drawing/2016/5/14/chartex" xmlns:mc="http://schemas.openxmlformats.org/markup-compatibility/2006" xmlns:aink="http://schemas.microsoft.com/office/drawing/2016/ink" xmlns:am3d="http://schemas.microsoft.com/office/drawing/2017/model3d" xmlns:o="urn:schemas-microsoft-com:office:office" xmlns:oel="http://schemas.microsoft.com/office/2019/extlst" xmlns:r="http://schemas.openxmlformats.org/officeDocument/2006/relationships" xmlns:m="http://schemas.openxmlformats.org/officeDocument/2006/math" xmlns:v="urn:schemas-microsoft-com:vml" xmlns:wp14="http://schemas.microsoft.com/office/word/2010/wordprocessingDrawing" xmlns:wp="http://schemas.openxmlformats.org/drawingml/2006/wordprocessingDrawing" xmlns:w10="urn:schemas-microsoft-com:office:word" xmlns:w="http://schemas.openxmlformats.org/wordprocessingml/2006/main" xmlns:w14="http://schemas.microsoft.com/office/word/2010/wordml" xmlns:w15="http://schemas.microsoft.com/office/word/2012/wordml" xmlns:w16cex="http://schemas.microsoft.com/office/word/2018/wordml/cex" xmlns:w16cid="http://schemas.microsoft.com/office/word/2016/wordml/cid" xmlns:w16="http://schemas.microsoft.com/office/word/2018/wordml" xmlns:w16du="http://schemas.microsoft.com/office/word/2023/wordml/word16du" xmlns:w16sdtdh="http://schemas.microsoft.com/office/word/2020/wordml/sdtdatahash" xmlns:w16sdtfl="http://schemas.microsoft.com/office/word/2024/wordml/sdtformatlock" xmlns:w16se="http://schemas.microsoft.com/office/word/2015/wordml/symex" xmlns:wpg="http://schemas.microsoft.com/office/word/2010/wordprocessingGroup" xmlns:wpi="http://schemas.microsoft.com/office/word/2010/wordprocessingInk" xmlns:wne="http://schemas.microsoft.com/office/word/2006/wordml" xmlns:wps="http://schemas.microsoft.com/office/word/2010/wordprocessingShape" mc:Ignorable="w14 w15 w16se w16cid w16 w16cex w16sdtdh w16sdtfl w16du wp14">
+<w:numbering xmlns:wpc="http://schemas.microsoft.com/office/word/2010/wordprocessingCanvas" xmlns:cx="http://schemas.microsoft.com/office/drawing/2014/chartex" xmlns:cx1="http://schemas.microsoft.com/office/drawing/2015/9/8/chartex" xmlns:cx2="http://schemas.microsoft.com/office/drawing/2015/10/21/chartex" xmlns:cx3="http://schemas.microsoft.com/office/drawing/2016/5/9/chartex" xmlns:cx4="http://schemas.microsoft.com/office/drawing/2016/5/10/chartex" xmlns:cx5="http://schemas.microsoft.com/office/drawing/2016/5/11/chartex" xmlns:cx6="http://schemas.microsoft.com/office/drawing/2016/5/12/chartex" xmlns:cx7="http://schemas.microsoft.com/office/drawing/2016/5/13/chartex" xmlns:cx8="http://schemas.microsoft.com/office/drawing/2016/5/14/chartex" xmlns:mc="http://schemas.openxmlformats.org/markup-compatibility/2006" xmlns:m="http://schemas.openxmlformats.org/officeDocument/2006/math" xmlns:aink="http://schemas.microsoft.com/office/drawing/2016/ink" xmlns:am3d="http://schemas.microsoft.com/office/drawing/2017/model3d" xmlns:oel="http://schemas.microsoft.com/office/2019/extlst" xmlns:r="http://schemas.openxmlformats.org/officeDocument/2006/relationships" xmlns:wp14="http://schemas.microsoft.com/office/word/2010/wordprocessingDrawing" xmlns:wp="http://schemas.openxmlformats.org/drawingml/2006/wordprocessingDrawing" xmlns:wpg="http://schemas.microsoft.com/office/word/2010/wordprocessingGroup" xmlns:wpi="http://schemas.microsoft.com/office/word/2010/wordprocessingInk" xmlns:wps="http://schemas.microsoft.com/office/word/2010/wordprocessingShape" xmlns:o="urn:schemas-microsoft-com:office:office" xmlns:v="urn:schemas-microsoft-com:vml" xmlns:w10="urn:schemas-microsoft-com:office:word" xmlns:w="http://schemas.openxmlformats.org/wordprocessingml/2006/main" xmlns:w14="http://schemas.microsoft.com/office/word/2010/wordml" xmlns:w15="http://schemas.microsoft.com/office/word/2012/wordml" xmlns:w16cex="http://schemas.microsoft.com/office/word/2018/wordml/cex" xmlns:w16cid="http://schemas.microsoft.com/office/word/2016/wordml/cid" xmlns:w16="http://schemas.microsoft.com/office/word/2018/wordml" xmlns:w16sdtdh="http://schemas.microsoft.com/office/word/2020/wordml/sdtdatahash" xmlns:w16sdtfl="http://schemas.microsoft.com/office/word/2024/wordml/sdtformatlock" xmlns:w16se="http://schemas.microsoft.com/office/word/2015/wordml/symex" xmlns:w16du="http://schemas.microsoft.com/office/word/2023/wordml/word16du" xmlns:wne="http://schemas.microsoft.com/office/word/2006/wordml" mc:Ignorable="w14 w15 w16se w16cid w16 w16cex w16sdtdh w16sdtfl w16du wp14">
   <w:abstractNum w:abstractNumId="0" w15:restartNumberingAfterBreak="0">
     <w:nsid w:val="0ACC651F"/>
     <w:multiLevelType w:val="hybridMultilevel"/>
@@ -3431,7 +4118,7 @@
 </file>
 
 <file path=word/styles.xml><?xml version="1.0" encoding="utf-8"?>
-<w:styles xmlns:mc="http://schemas.openxmlformats.org/markup-compatibility/2006" xmlns:r="http://schemas.openxmlformats.org/officeDocument/2006/relationships" xmlns:w="http://schemas.openxmlformats.org/wordprocessingml/2006/main" xmlns:w14="http://schemas.microsoft.com/office/word/2010/wordml" xmlns:w15="http://schemas.microsoft.com/office/word/2012/wordml" xmlns:w16cex="http://schemas.microsoft.com/office/word/2018/wordml/cex" xmlns:w16cid="http://schemas.microsoft.com/office/word/2016/wordml/cid" xmlns:w16="http://schemas.microsoft.com/office/word/2018/wordml" xmlns:w16du="http://schemas.microsoft.com/office/word/2023/wordml/word16du" xmlns:w16sdtdh="http://schemas.microsoft.com/office/word/2020/wordml/sdtdatahash" xmlns:w16sdtfl="http://schemas.microsoft.com/office/word/2024/wordml/sdtformatlock" xmlns:w16se="http://schemas.microsoft.com/office/word/2015/wordml/symex" mc:Ignorable="w14 w15 w16se w16cid w16 w16cex w16sdtdh w16sdtfl w16du">
+<w:styles xmlns:mc="http://schemas.openxmlformats.org/markup-compatibility/2006" xmlns:r="http://schemas.openxmlformats.org/officeDocument/2006/relationships" xmlns:w="http://schemas.openxmlformats.org/wordprocessingml/2006/main" xmlns:w14="http://schemas.microsoft.com/office/word/2010/wordml" xmlns:w15="http://schemas.microsoft.com/office/word/2012/wordml" xmlns:w16cex="http://schemas.microsoft.com/office/word/2018/wordml/cex" xmlns:w16cid="http://schemas.microsoft.com/office/word/2016/wordml/cid" xmlns:w16="http://schemas.microsoft.com/office/word/2018/wordml" xmlns:w16sdtdh="http://schemas.microsoft.com/office/word/2020/wordml/sdtdatahash" xmlns:w16sdtfl="http://schemas.microsoft.com/office/word/2024/wordml/sdtformatlock" xmlns:w16se="http://schemas.microsoft.com/office/word/2015/wordml/symex" xmlns:w16du="http://schemas.microsoft.com/office/word/2023/wordml/word16du" mc:Ignorable="w14 w15 w16se w16cid w16 w16cex w16sdtdh w16sdtfl w16du">
   <w:docDefaults>
     <w:rPrDefault>
       <w:rPr>
@@ -4041,6 +4728,7 @@
   <w:style w:type="character" w:default="1" w:styleId="DefaultParagraphFont">
     <w:name w:val="Default Paragraph Font"/>
     <w:uiPriority w:val="1"/>
+    <w:semiHidden/>
     <w:unhideWhenUsed/>
   </w:style>
   <w:style w:type="table" w:default="1" w:styleId="TableNormal">

</xml_diff>